<commit_message>
Update last version to publish website
</commit_message>
<xml_diff>
--- a/document/Thuật ngữ chuyên ngành.docx
+++ b/document/Thuật ngữ chuyên ngành.docx
@@ -10,6 +10,7 @@
         <w:jc w:val="center"/>
         <w:rPr>
           <w:rFonts w:hint="default" w:ascii="Times New Roman" w:hAnsi="Times New Roman" w:cs="Times New Roman"/>
+          <w:lang w:val="vi-VN"/>
         </w:rPr>
       </w:pPr>
       <w:r>
@@ -24,6 +25,13 @@
           <w:rFonts w:hint="default" w:ascii="Times New Roman" w:hAnsi="Times New Roman" w:cs="Times New Roman"/>
         </w:rPr>
         <w:t>huật ngữ chuyên ngành</w:t>
+      </w:r>
+      <w:r>
+        <w:rPr>
+          <w:rFonts w:hint="default" w:ascii="Times New Roman" w:hAnsi="Times New Roman" w:cs="Times New Roman"/>
+          <w:lang w:val="vi-VN"/>
+        </w:rPr>
+        <w:t xml:space="preserve"> dự án</w:t>
       </w:r>
     </w:p>
     <w:p>
@@ -89,6 +97,12 @@
             <w:insideV w:val="none" w:color="auto" w:sz="0" w:space="0"/>
           </w:tblBorders>
           <w:shd w:val="clear" w:color="auto" w:fill="auto"/>
+          <w:tblCellMar>
+            <w:top w:w="15" w:type="dxa"/>
+            <w:left w:w="15" w:type="dxa"/>
+            <w:bottom w:w="15" w:type="dxa"/>
+            <w:right w:w="15" w:type="dxa"/>
+          </w:tblCellMar>
         </w:tblPrEx>
         <w:trPr>
           <w:tblHeader/>
@@ -279,7 +293,6 @@
             <w:insideH w:val="none" w:color="auto" w:sz="0" w:space="0"/>
             <w:insideV w:val="none" w:color="auto" w:sz="0" w:space="0"/>
           </w:tblBorders>
-          <w:shd w:val="clear" w:color="auto" w:fill="auto"/>
           <w:tblCellMar>
             <w:top w:w="15" w:type="dxa"/>
             <w:left w:w="15" w:type="dxa"/>
@@ -458,7 +471,6 @@
             <w:insideH w:val="none" w:color="auto" w:sz="0" w:space="0"/>
             <w:insideV w:val="none" w:color="auto" w:sz="0" w:space="0"/>
           </w:tblBorders>
-          <w:shd w:val="clear" w:color="auto" w:fill="auto"/>
           <w:tblCellMar>
             <w:top w:w="15" w:type="dxa"/>
             <w:left w:w="15" w:type="dxa"/>
@@ -994,7 +1006,6 @@
             <w:insideH w:val="none" w:color="auto" w:sz="0" w:space="0"/>
             <w:insideV w:val="none" w:color="auto" w:sz="0" w:space="0"/>
           </w:tblBorders>
-          <w:shd w:val="clear" w:color="auto" w:fill="auto"/>
           <w:tblCellMar>
             <w:top w:w="15" w:type="dxa"/>
             <w:left w:w="15" w:type="dxa"/>
@@ -1888,6 +1899,7 @@
             <w:insideH w:val="none" w:color="auto" w:sz="0" w:space="0"/>
             <w:insideV w:val="none" w:color="auto" w:sz="0" w:space="0"/>
           </w:tblBorders>
+          <w:shd w:val="clear" w:color="auto" w:fill="auto"/>
           <w:tblCellMar>
             <w:top w:w="15" w:type="dxa"/>
             <w:left w:w="15" w:type="dxa"/>
@@ -2066,6 +2078,7 @@
             <w:insideH w:val="none" w:color="auto" w:sz="0" w:space="0"/>
             <w:insideV w:val="none" w:color="auto" w:sz="0" w:space="0"/>
           </w:tblBorders>
+          <w:shd w:val="clear" w:color="auto" w:fill="auto"/>
           <w:tblCellMar>
             <w:top w:w="15" w:type="dxa"/>
             <w:left w:w="15" w:type="dxa"/>
@@ -2244,7 +2257,6 @@
             <w:insideH w:val="none" w:color="auto" w:sz="0" w:space="0"/>
             <w:insideV w:val="none" w:color="auto" w:sz="0" w:space="0"/>
           </w:tblBorders>
-          <w:shd w:val="clear" w:color="auto" w:fill="auto"/>
           <w:tblCellMar>
             <w:top w:w="15" w:type="dxa"/>
             <w:left w:w="15" w:type="dxa"/>
@@ -2781,6 +2793,7 @@
             <w:insideH w:val="none" w:color="auto" w:sz="0" w:space="0"/>
             <w:insideV w:val="none" w:color="auto" w:sz="0" w:space="0"/>
           </w:tblBorders>
+          <w:shd w:val="clear" w:color="auto" w:fill="auto"/>
           <w:tblCellMar>
             <w:top w:w="15" w:type="dxa"/>
             <w:left w:w="15" w:type="dxa"/>
@@ -2945,6 +2958,363 @@
                 <w:lang w:val="en-US" w:eastAsia="zh-CN" w:bidi="ar"/>
               </w:rPr>
               <w:t>Redis chịu được 100.000–500.000 ops/s</w:t>
+            </w:r>
+          </w:p>
+        </w:tc>
+      </w:tr>
+      <w:tr>
+        <w:tblPrEx>
+          <w:tblBorders>
+            <w:top w:val="none" w:color="auto" w:sz="0" w:space="0"/>
+            <w:left w:val="none" w:color="auto" w:sz="0" w:space="0"/>
+            <w:bottom w:val="none" w:color="auto" w:sz="0" w:space="0"/>
+            <w:right w:val="none" w:color="auto" w:sz="0" w:space="0"/>
+            <w:insideH w:val="none" w:color="auto" w:sz="0" w:space="0"/>
+            <w:insideV w:val="none" w:color="auto" w:sz="0" w:space="0"/>
+          </w:tblBorders>
+          <w:tblCellMar>
+            <w:top w:w="15" w:type="dxa"/>
+            <w:left w:w="15" w:type="dxa"/>
+            <w:bottom w:w="15" w:type="dxa"/>
+            <w:right w:w="15" w:type="dxa"/>
+          </w:tblCellMar>
+        </w:tblPrEx>
+        <w:trPr>
+          <w:tblCellSpacing w:w="15" w:type="dxa"/>
+          <w:jc w:val="center"/>
+        </w:trPr>
+        <w:tc>
+          <w:tcPr>
+            <w:tcW w:w="0" w:type="auto"/>
+            <w:tcBorders>
+              <w:top w:val="single" w:color="4F81BD" w:sz="8" w:space="0"/>
+              <w:left w:val="single" w:color="4F81BD" w:sz="8" w:space="0"/>
+              <w:bottom w:val="single" w:color="4F81BD" w:sz="8" w:space="0"/>
+              <w:right w:val="single" w:color="4F81BD" w:sz="8" w:space="0"/>
+            </w:tcBorders>
+            <w:shd w:val="clear" w:color="auto" w:fill="FFFFFF"/>
+            <w:vAlign w:val="center"/>
+          </w:tcPr>
+          <w:p>
+            <w:pPr>
+              <w:keepNext w:val="0"/>
+              <w:keepLines w:val="0"/>
+              <w:widowControl/>
+              <w:suppressLineNumbers w:val="0"/>
+              <w:jc w:val="center"/>
+              <w:rPr>
+                <w:rFonts w:hint="default" w:ascii="Times New Roman" w:hAnsi="Times New Roman" w:cs="Times New Roman"/>
+                <w:color w:val="000000"/>
+                <w:sz w:val="18"/>
+                <w:szCs w:val="18"/>
+              </w:rPr>
+            </w:pPr>
+            <w:r>
+              <w:rPr>
+                <w:rFonts w:hint="default" w:ascii="Times New Roman" w:hAnsi="Times New Roman" w:eastAsia="SimSun" w:cs="Times New Roman"/>
+                <w:color w:val="000000"/>
+                <w:kern w:val="0"/>
+                <w:sz w:val="22"/>
+                <w:szCs w:val="22"/>
+                <w:lang w:val="en-US" w:eastAsia="zh-CN" w:bidi="ar"/>
+              </w:rPr>
+              <w:t>HLL</w:t>
+            </w:r>
+          </w:p>
+        </w:tc>
+        <w:tc>
+          <w:tcPr>
+            <w:tcW w:w="0" w:type="auto"/>
+            <w:tcBorders>
+              <w:top w:val="single" w:color="4F81BD" w:sz="8" w:space="0"/>
+              <w:left w:val="single" w:color="4F81BD" w:sz="8" w:space="0"/>
+              <w:bottom w:val="single" w:color="4F81BD" w:sz="8" w:space="0"/>
+              <w:right w:val="single" w:color="4F81BD" w:sz="8" w:space="0"/>
+            </w:tcBorders>
+            <w:shd w:val="clear" w:color="auto" w:fill="FFFFFF"/>
+            <w:vAlign w:val="center"/>
+          </w:tcPr>
+          <w:p>
+            <w:pPr>
+              <w:keepNext w:val="0"/>
+              <w:keepLines w:val="0"/>
+              <w:widowControl/>
+              <w:suppressLineNumbers w:val="0"/>
+              <w:jc w:val="center"/>
+              <w:rPr>
+                <w:rFonts w:hint="default" w:ascii="Times New Roman" w:hAnsi="Times New Roman" w:cs="Times New Roman"/>
+                <w:color w:val="000000"/>
+                <w:sz w:val="18"/>
+                <w:szCs w:val="18"/>
+              </w:rPr>
+            </w:pPr>
+            <w:r>
+              <w:rPr>
+                <w:rFonts w:hint="default" w:ascii="Times New Roman" w:hAnsi="Times New Roman" w:eastAsia="SimSun" w:cs="Times New Roman"/>
+                <w:color w:val="000000"/>
+                <w:kern w:val="0"/>
+                <w:sz w:val="22"/>
+                <w:szCs w:val="22"/>
+                <w:lang w:val="en-US" w:eastAsia="zh-CN" w:bidi="ar"/>
+              </w:rPr>
+              <w:t>HyperLogLog (Redis structure)</w:t>
+            </w:r>
+          </w:p>
+        </w:tc>
+        <w:tc>
+          <w:tcPr>
+            <w:tcW w:w="0" w:type="auto"/>
+            <w:tcBorders>
+              <w:top w:val="single" w:color="4F81BD" w:sz="8" w:space="0"/>
+              <w:left w:val="single" w:color="4F81BD" w:sz="8" w:space="0"/>
+              <w:bottom w:val="single" w:color="4F81BD" w:sz="8" w:space="0"/>
+              <w:right w:val="single" w:color="4F81BD" w:sz="8" w:space="0"/>
+            </w:tcBorders>
+            <w:shd w:val="clear" w:color="auto" w:fill="FFFFFF"/>
+            <w:vAlign w:val="center"/>
+          </w:tcPr>
+          <w:p>
+            <w:pPr>
+              <w:keepNext w:val="0"/>
+              <w:keepLines w:val="0"/>
+              <w:widowControl/>
+              <w:suppressLineNumbers w:val="0"/>
+              <w:jc w:val="center"/>
+              <w:rPr>
+                <w:rFonts w:hint="default" w:ascii="Times New Roman" w:hAnsi="Times New Roman" w:cs="Times New Roman"/>
+                <w:color w:val="000000"/>
+                <w:sz w:val="18"/>
+                <w:szCs w:val="18"/>
+              </w:rPr>
+            </w:pPr>
+            <w:r>
+              <w:rPr>
+                <w:rFonts w:hint="default" w:ascii="Times New Roman" w:hAnsi="Times New Roman" w:eastAsia="SimSun" w:cs="Times New Roman"/>
+                <w:color w:val="000000"/>
+                <w:kern w:val="0"/>
+                <w:sz w:val="22"/>
+                <w:szCs w:val="22"/>
+                <w:lang w:val="en-US" w:eastAsia="zh-CN" w:bidi="ar"/>
+              </w:rPr>
+              <w:t>Cấu trúc đếm gần đúng nhưng cực tiết kiệm RAM</w:t>
+            </w:r>
+          </w:p>
+        </w:tc>
+        <w:tc>
+          <w:tcPr>
+            <w:tcW w:w="0" w:type="auto"/>
+            <w:tcBorders>
+              <w:top w:val="single" w:color="4F81BD" w:sz="8" w:space="0"/>
+              <w:left w:val="single" w:color="4F81BD" w:sz="8" w:space="0"/>
+              <w:bottom w:val="single" w:color="4F81BD" w:sz="8" w:space="0"/>
+              <w:right w:val="single" w:color="4F81BD" w:sz="8" w:space="0"/>
+            </w:tcBorders>
+            <w:shd w:val="clear" w:color="auto" w:fill="FFFFFF"/>
+            <w:vAlign w:val="center"/>
+          </w:tcPr>
+          <w:p>
+            <w:pPr>
+              <w:keepNext w:val="0"/>
+              <w:keepLines w:val="0"/>
+              <w:widowControl/>
+              <w:suppressLineNumbers w:val="0"/>
+              <w:jc w:val="center"/>
+              <w:rPr>
+                <w:rFonts w:hint="default" w:ascii="Times New Roman" w:hAnsi="Times New Roman" w:cs="Times New Roman"/>
+                <w:color w:val="000000"/>
+                <w:sz w:val="18"/>
+                <w:szCs w:val="18"/>
+              </w:rPr>
+            </w:pPr>
+            <w:r>
+              <w:rPr>
+                <w:rFonts w:hint="default" w:ascii="Times New Roman" w:hAnsi="Times New Roman" w:eastAsia="SimSun" w:cs="Times New Roman"/>
+                <w:color w:val="000000"/>
+                <w:kern w:val="0"/>
+                <w:sz w:val="22"/>
+                <w:szCs w:val="22"/>
+                <w:lang w:val="en-US" w:eastAsia="zh-CN" w:bidi="ar"/>
+              </w:rPr>
+              <w:t>Shopee, TikTok Shop dùng khi UV &gt; 50 triệu/ngày</w:t>
+            </w:r>
+          </w:p>
+        </w:tc>
+      </w:tr>
+      <w:tr>
+        <w:tblPrEx>
+          <w:tblBorders>
+            <w:top w:val="none" w:color="auto" w:sz="0" w:space="0"/>
+            <w:left w:val="none" w:color="auto" w:sz="0" w:space="0"/>
+            <w:bottom w:val="none" w:color="auto" w:sz="0" w:space="0"/>
+            <w:right w:val="none" w:color="auto" w:sz="0" w:space="0"/>
+            <w:insideH w:val="none" w:color="auto" w:sz="0" w:space="0"/>
+            <w:insideV w:val="none" w:color="auto" w:sz="0" w:space="0"/>
+          </w:tblBorders>
+          <w:shd w:val="clear" w:color="auto" w:fill="auto"/>
+          <w:tblCellMar>
+            <w:top w:w="15" w:type="dxa"/>
+            <w:left w:w="15" w:type="dxa"/>
+            <w:bottom w:w="15" w:type="dxa"/>
+            <w:right w:w="15" w:type="dxa"/>
+          </w:tblCellMar>
+        </w:tblPrEx>
+        <w:trPr>
+          <w:tblCellSpacing w:w="15" w:type="dxa"/>
+          <w:jc w:val="center"/>
+        </w:trPr>
+        <w:tc>
+          <w:tcPr>
+            <w:tcW w:w="0" w:type="auto"/>
+            <w:tcBorders>
+              <w:top w:val="single" w:color="4F81BD" w:sz="8" w:space="0"/>
+              <w:left w:val="single" w:color="4F81BD" w:sz="8" w:space="0"/>
+              <w:bottom w:val="single" w:color="4F81BD" w:sz="8" w:space="0"/>
+              <w:right w:val="single" w:color="4F81BD" w:sz="8" w:space="0"/>
+            </w:tcBorders>
+            <w:shd w:val="clear" w:color="auto" w:fill="B8CCE4"/>
+            <w:vAlign w:val="center"/>
+          </w:tcPr>
+          <w:p>
+            <w:pPr>
+              <w:keepNext w:val="0"/>
+              <w:keepLines w:val="0"/>
+              <w:widowControl/>
+              <w:suppressLineNumbers w:val="0"/>
+              <w:jc w:val="center"/>
+              <w:rPr>
+                <w:rFonts w:hint="default" w:ascii="Times New Roman" w:hAnsi="Times New Roman" w:cs="Times New Roman"/>
+                <w:color w:val="000000"/>
+                <w:sz w:val="18"/>
+                <w:szCs w:val="18"/>
+              </w:rPr>
+            </w:pPr>
+            <w:r>
+              <w:rPr>
+                <w:rFonts w:hint="default" w:ascii="Times New Roman" w:hAnsi="Times New Roman" w:eastAsia="SimSun" w:cs="Times New Roman"/>
+                <w:color w:val="000000"/>
+                <w:kern w:val="0"/>
+                <w:sz w:val="22"/>
+                <w:szCs w:val="22"/>
+                <w:lang w:val="en-US" w:eastAsia="zh-CN" w:bidi="ar"/>
+              </w:rPr>
+              <w:t>EF Core</w:t>
+            </w:r>
+          </w:p>
+        </w:tc>
+        <w:tc>
+          <w:tcPr>
+            <w:tcW w:w="0" w:type="auto"/>
+            <w:tcBorders>
+              <w:top w:val="single" w:color="4F81BD" w:sz="8" w:space="0"/>
+              <w:left w:val="single" w:color="4F81BD" w:sz="8" w:space="0"/>
+              <w:bottom w:val="single" w:color="4F81BD" w:sz="8" w:space="0"/>
+              <w:right w:val="single" w:color="4F81BD" w:sz="8" w:space="0"/>
+            </w:tcBorders>
+            <w:shd w:val="clear" w:color="auto" w:fill="B8CCE4"/>
+            <w:vAlign w:val="center"/>
+          </w:tcPr>
+          <w:p>
+            <w:pPr>
+              <w:keepNext w:val="0"/>
+              <w:keepLines w:val="0"/>
+              <w:widowControl/>
+              <w:suppressLineNumbers w:val="0"/>
+              <w:jc w:val="center"/>
+              <w:rPr>
+                <w:rFonts w:hint="default" w:ascii="Times New Roman" w:hAnsi="Times New Roman" w:cs="Times New Roman"/>
+                <w:color w:val="000000"/>
+                <w:sz w:val="18"/>
+                <w:szCs w:val="18"/>
+              </w:rPr>
+            </w:pPr>
+            <w:r>
+              <w:rPr>
+                <w:rFonts w:hint="default" w:ascii="Times New Roman" w:hAnsi="Times New Roman" w:eastAsia="SimSun" w:cs="Times New Roman"/>
+                <w:color w:val="000000"/>
+                <w:kern w:val="0"/>
+                <w:sz w:val="22"/>
+                <w:szCs w:val="22"/>
+                <w:lang w:val="en-US" w:eastAsia="zh-CN" w:bidi="ar"/>
+              </w:rPr>
+              <w:t>Entity Framework Core</w:t>
+            </w:r>
+          </w:p>
+        </w:tc>
+        <w:tc>
+          <w:tcPr>
+            <w:tcW w:w="0" w:type="auto"/>
+            <w:tcBorders>
+              <w:top w:val="single" w:color="4F81BD" w:sz="8" w:space="0"/>
+              <w:left w:val="single" w:color="4F81BD" w:sz="8" w:space="0"/>
+              <w:bottom w:val="single" w:color="4F81BD" w:sz="8" w:space="0"/>
+              <w:right w:val="single" w:color="4F81BD" w:sz="8" w:space="0"/>
+            </w:tcBorders>
+            <w:shd w:val="clear" w:color="auto" w:fill="B8CCE4"/>
+            <w:vAlign w:val="center"/>
+          </w:tcPr>
+          <w:p>
+            <w:pPr>
+              <w:keepNext w:val="0"/>
+              <w:keepLines w:val="0"/>
+              <w:widowControl/>
+              <w:suppressLineNumbers w:val="0"/>
+              <w:jc w:val="center"/>
+              <w:rPr>
+                <w:rFonts w:hint="default" w:ascii="Times New Roman" w:hAnsi="Times New Roman" w:cs="Times New Roman"/>
+                <w:color w:val="000000"/>
+                <w:sz w:val="18"/>
+                <w:szCs w:val="18"/>
+              </w:rPr>
+            </w:pPr>
+            <w:r>
+              <w:rPr>
+                <w:rFonts w:hint="default" w:ascii="Times New Roman" w:hAnsi="Times New Roman" w:eastAsia="SimSun" w:cs="Times New Roman"/>
+                <w:color w:val="000000"/>
+                <w:kern w:val="0"/>
+                <w:sz w:val="22"/>
+                <w:szCs w:val="22"/>
+                <w:lang w:val="en-US" w:eastAsia="zh-CN" w:bidi="ar"/>
+              </w:rPr>
+              <w:t>ORM chính thức của Microsoft</w:t>
+            </w:r>
+          </w:p>
+        </w:tc>
+        <w:tc>
+          <w:tcPr>
+            <w:tcW w:w="0" w:type="auto"/>
+            <w:tcBorders>
+              <w:top w:val="single" w:color="4F81BD" w:sz="8" w:space="0"/>
+              <w:left w:val="single" w:color="4F81BD" w:sz="8" w:space="0"/>
+              <w:bottom w:val="single" w:color="4F81BD" w:sz="8" w:space="0"/>
+              <w:right w:val="single" w:color="4F81BD" w:sz="8" w:space="0"/>
+            </w:tcBorders>
+            <w:shd w:val="clear" w:color="auto" w:fill="B8CCE4"/>
+            <w:vAlign w:val="center"/>
+          </w:tcPr>
+          <w:p>
+            <w:pPr>
+              <w:keepNext w:val="0"/>
+              <w:keepLines w:val="0"/>
+              <w:widowControl/>
+              <w:suppressLineNumbers w:val="0"/>
+              <w:jc w:val="center"/>
+              <w:rPr>
+                <w:rFonts w:hint="default" w:ascii="Times New Roman" w:hAnsi="Times New Roman" w:cs="Times New Roman"/>
+                <w:color w:val="000000"/>
+                <w:sz w:val="18"/>
+                <w:szCs w:val="18"/>
+              </w:rPr>
+            </w:pPr>
+            <w:r>
+              <w:rPr>
+                <w:rFonts w:hint="default" w:ascii="Times New Roman" w:hAnsi="Times New Roman" w:eastAsia="SimSun" w:cs="Times New Roman"/>
+                <w:color w:val="000000"/>
+                <w:kern w:val="0"/>
+                <w:sz w:val="22"/>
+                <w:szCs w:val="22"/>
+                <w:lang w:val="en-US" w:eastAsia="zh-CN" w:bidi="ar"/>
+              </w:rPr>
+              <w:t>Dùng để ghi vào SQL cuối ngày</w:t>
             </w:r>
           </w:p>
         </w:tc>
@@ -3006,356 +3376,6 @@
                 <w:szCs w:val="22"/>
                 <w:lang w:val="en-US" w:eastAsia="zh-CN" w:bidi="ar"/>
               </w:rPr>
-              <w:t>HLL</w:t>
-            </w:r>
-          </w:p>
-        </w:tc>
-        <w:tc>
-          <w:tcPr>
-            <w:tcW w:w="0" w:type="auto"/>
-            <w:tcBorders>
-              <w:top w:val="single" w:color="4F81BD" w:sz="8" w:space="0"/>
-              <w:left w:val="single" w:color="4F81BD" w:sz="8" w:space="0"/>
-              <w:bottom w:val="single" w:color="4F81BD" w:sz="8" w:space="0"/>
-              <w:right w:val="single" w:color="4F81BD" w:sz="8" w:space="0"/>
-            </w:tcBorders>
-            <w:shd w:val="clear" w:color="auto" w:fill="FFFFFF"/>
-            <w:vAlign w:val="center"/>
-          </w:tcPr>
-          <w:p>
-            <w:pPr>
-              <w:keepNext w:val="0"/>
-              <w:keepLines w:val="0"/>
-              <w:widowControl/>
-              <w:suppressLineNumbers w:val="0"/>
-              <w:jc w:val="center"/>
-              <w:rPr>
-                <w:rFonts w:hint="default" w:ascii="Times New Roman" w:hAnsi="Times New Roman" w:cs="Times New Roman"/>
-                <w:color w:val="000000"/>
-                <w:sz w:val="18"/>
-                <w:szCs w:val="18"/>
-              </w:rPr>
-            </w:pPr>
-            <w:r>
-              <w:rPr>
-                <w:rFonts w:hint="default" w:ascii="Times New Roman" w:hAnsi="Times New Roman" w:eastAsia="SimSun" w:cs="Times New Roman"/>
-                <w:color w:val="000000"/>
-                <w:kern w:val="0"/>
-                <w:sz w:val="22"/>
-                <w:szCs w:val="22"/>
-                <w:lang w:val="en-US" w:eastAsia="zh-CN" w:bidi="ar"/>
-              </w:rPr>
-              <w:t>HyperLogLog (Redis structure)</w:t>
-            </w:r>
-          </w:p>
-        </w:tc>
-        <w:tc>
-          <w:tcPr>
-            <w:tcW w:w="0" w:type="auto"/>
-            <w:tcBorders>
-              <w:top w:val="single" w:color="4F81BD" w:sz="8" w:space="0"/>
-              <w:left w:val="single" w:color="4F81BD" w:sz="8" w:space="0"/>
-              <w:bottom w:val="single" w:color="4F81BD" w:sz="8" w:space="0"/>
-              <w:right w:val="single" w:color="4F81BD" w:sz="8" w:space="0"/>
-            </w:tcBorders>
-            <w:shd w:val="clear" w:color="auto" w:fill="FFFFFF"/>
-            <w:vAlign w:val="center"/>
-          </w:tcPr>
-          <w:p>
-            <w:pPr>
-              <w:keepNext w:val="0"/>
-              <w:keepLines w:val="0"/>
-              <w:widowControl/>
-              <w:suppressLineNumbers w:val="0"/>
-              <w:jc w:val="center"/>
-              <w:rPr>
-                <w:rFonts w:hint="default" w:ascii="Times New Roman" w:hAnsi="Times New Roman" w:cs="Times New Roman"/>
-                <w:color w:val="000000"/>
-                <w:sz w:val="18"/>
-                <w:szCs w:val="18"/>
-              </w:rPr>
-            </w:pPr>
-            <w:r>
-              <w:rPr>
-                <w:rFonts w:hint="default" w:ascii="Times New Roman" w:hAnsi="Times New Roman" w:eastAsia="SimSun" w:cs="Times New Roman"/>
-                <w:color w:val="000000"/>
-                <w:kern w:val="0"/>
-                <w:sz w:val="22"/>
-                <w:szCs w:val="22"/>
-                <w:lang w:val="en-US" w:eastAsia="zh-CN" w:bidi="ar"/>
-              </w:rPr>
-              <w:t>Cấu trúc đếm gần đúng nhưng cực tiết kiệm RAM</w:t>
-            </w:r>
-          </w:p>
-        </w:tc>
-        <w:tc>
-          <w:tcPr>
-            <w:tcW w:w="0" w:type="auto"/>
-            <w:tcBorders>
-              <w:top w:val="single" w:color="4F81BD" w:sz="8" w:space="0"/>
-              <w:left w:val="single" w:color="4F81BD" w:sz="8" w:space="0"/>
-              <w:bottom w:val="single" w:color="4F81BD" w:sz="8" w:space="0"/>
-              <w:right w:val="single" w:color="4F81BD" w:sz="8" w:space="0"/>
-            </w:tcBorders>
-            <w:shd w:val="clear" w:color="auto" w:fill="FFFFFF"/>
-            <w:vAlign w:val="center"/>
-          </w:tcPr>
-          <w:p>
-            <w:pPr>
-              <w:keepNext w:val="0"/>
-              <w:keepLines w:val="0"/>
-              <w:widowControl/>
-              <w:suppressLineNumbers w:val="0"/>
-              <w:jc w:val="center"/>
-              <w:rPr>
-                <w:rFonts w:hint="default" w:ascii="Times New Roman" w:hAnsi="Times New Roman" w:cs="Times New Roman"/>
-                <w:color w:val="000000"/>
-                <w:sz w:val="18"/>
-                <w:szCs w:val="18"/>
-              </w:rPr>
-            </w:pPr>
-            <w:r>
-              <w:rPr>
-                <w:rFonts w:hint="default" w:ascii="Times New Roman" w:hAnsi="Times New Roman" w:eastAsia="SimSun" w:cs="Times New Roman"/>
-                <w:color w:val="000000"/>
-                <w:kern w:val="0"/>
-                <w:sz w:val="22"/>
-                <w:szCs w:val="22"/>
-                <w:lang w:val="en-US" w:eastAsia="zh-CN" w:bidi="ar"/>
-              </w:rPr>
-              <w:t>Shopee, TikTok Shop dùng khi UV &gt; 50 triệu/ngày</w:t>
-            </w:r>
-          </w:p>
-        </w:tc>
-      </w:tr>
-      <w:tr>
-        <w:tblPrEx>
-          <w:tblBorders>
-            <w:top w:val="none" w:color="auto" w:sz="0" w:space="0"/>
-            <w:left w:val="none" w:color="auto" w:sz="0" w:space="0"/>
-            <w:bottom w:val="none" w:color="auto" w:sz="0" w:space="0"/>
-            <w:right w:val="none" w:color="auto" w:sz="0" w:space="0"/>
-            <w:insideH w:val="none" w:color="auto" w:sz="0" w:space="0"/>
-            <w:insideV w:val="none" w:color="auto" w:sz="0" w:space="0"/>
-          </w:tblBorders>
-        </w:tblPrEx>
-        <w:trPr>
-          <w:tblCellSpacing w:w="15" w:type="dxa"/>
-          <w:jc w:val="center"/>
-        </w:trPr>
-        <w:tc>
-          <w:tcPr>
-            <w:tcW w:w="0" w:type="auto"/>
-            <w:tcBorders>
-              <w:top w:val="single" w:color="4F81BD" w:sz="8" w:space="0"/>
-              <w:left w:val="single" w:color="4F81BD" w:sz="8" w:space="0"/>
-              <w:bottom w:val="single" w:color="4F81BD" w:sz="8" w:space="0"/>
-              <w:right w:val="single" w:color="4F81BD" w:sz="8" w:space="0"/>
-            </w:tcBorders>
-            <w:shd w:val="clear" w:color="auto" w:fill="B8CCE4"/>
-            <w:vAlign w:val="center"/>
-          </w:tcPr>
-          <w:p>
-            <w:pPr>
-              <w:keepNext w:val="0"/>
-              <w:keepLines w:val="0"/>
-              <w:widowControl/>
-              <w:suppressLineNumbers w:val="0"/>
-              <w:jc w:val="center"/>
-              <w:rPr>
-                <w:rFonts w:hint="default" w:ascii="Times New Roman" w:hAnsi="Times New Roman" w:cs="Times New Roman"/>
-                <w:color w:val="000000"/>
-                <w:sz w:val="18"/>
-                <w:szCs w:val="18"/>
-              </w:rPr>
-            </w:pPr>
-            <w:r>
-              <w:rPr>
-                <w:rFonts w:hint="default" w:ascii="Times New Roman" w:hAnsi="Times New Roman" w:eastAsia="SimSun" w:cs="Times New Roman"/>
-                <w:color w:val="000000"/>
-                <w:kern w:val="0"/>
-                <w:sz w:val="22"/>
-                <w:szCs w:val="22"/>
-                <w:lang w:val="en-US" w:eastAsia="zh-CN" w:bidi="ar"/>
-              </w:rPr>
-              <w:t>EF Core</w:t>
-            </w:r>
-          </w:p>
-        </w:tc>
-        <w:tc>
-          <w:tcPr>
-            <w:tcW w:w="0" w:type="auto"/>
-            <w:tcBorders>
-              <w:top w:val="single" w:color="4F81BD" w:sz="8" w:space="0"/>
-              <w:left w:val="single" w:color="4F81BD" w:sz="8" w:space="0"/>
-              <w:bottom w:val="single" w:color="4F81BD" w:sz="8" w:space="0"/>
-              <w:right w:val="single" w:color="4F81BD" w:sz="8" w:space="0"/>
-            </w:tcBorders>
-            <w:shd w:val="clear" w:color="auto" w:fill="B8CCE4"/>
-            <w:vAlign w:val="center"/>
-          </w:tcPr>
-          <w:p>
-            <w:pPr>
-              <w:keepNext w:val="0"/>
-              <w:keepLines w:val="0"/>
-              <w:widowControl/>
-              <w:suppressLineNumbers w:val="0"/>
-              <w:jc w:val="center"/>
-              <w:rPr>
-                <w:rFonts w:hint="default" w:ascii="Times New Roman" w:hAnsi="Times New Roman" w:cs="Times New Roman"/>
-                <w:color w:val="000000"/>
-                <w:sz w:val="18"/>
-                <w:szCs w:val="18"/>
-              </w:rPr>
-            </w:pPr>
-            <w:r>
-              <w:rPr>
-                <w:rFonts w:hint="default" w:ascii="Times New Roman" w:hAnsi="Times New Roman" w:eastAsia="SimSun" w:cs="Times New Roman"/>
-                <w:color w:val="000000"/>
-                <w:kern w:val="0"/>
-                <w:sz w:val="22"/>
-                <w:szCs w:val="22"/>
-                <w:lang w:val="en-US" w:eastAsia="zh-CN" w:bidi="ar"/>
-              </w:rPr>
-              <w:t>Entity Framework Core</w:t>
-            </w:r>
-          </w:p>
-        </w:tc>
-        <w:tc>
-          <w:tcPr>
-            <w:tcW w:w="0" w:type="auto"/>
-            <w:tcBorders>
-              <w:top w:val="single" w:color="4F81BD" w:sz="8" w:space="0"/>
-              <w:left w:val="single" w:color="4F81BD" w:sz="8" w:space="0"/>
-              <w:bottom w:val="single" w:color="4F81BD" w:sz="8" w:space="0"/>
-              <w:right w:val="single" w:color="4F81BD" w:sz="8" w:space="0"/>
-            </w:tcBorders>
-            <w:shd w:val="clear" w:color="auto" w:fill="B8CCE4"/>
-            <w:vAlign w:val="center"/>
-          </w:tcPr>
-          <w:p>
-            <w:pPr>
-              <w:keepNext w:val="0"/>
-              <w:keepLines w:val="0"/>
-              <w:widowControl/>
-              <w:suppressLineNumbers w:val="0"/>
-              <w:jc w:val="center"/>
-              <w:rPr>
-                <w:rFonts w:hint="default" w:ascii="Times New Roman" w:hAnsi="Times New Roman" w:cs="Times New Roman"/>
-                <w:color w:val="000000"/>
-                <w:sz w:val="18"/>
-                <w:szCs w:val="18"/>
-              </w:rPr>
-            </w:pPr>
-            <w:r>
-              <w:rPr>
-                <w:rFonts w:hint="default" w:ascii="Times New Roman" w:hAnsi="Times New Roman" w:eastAsia="SimSun" w:cs="Times New Roman"/>
-                <w:color w:val="000000"/>
-                <w:kern w:val="0"/>
-                <w:sz w:val="22"/>
-                <w:szCs w:val="22"/>
-                <w:lang w:val="en-US" w:eastAsia="zh-CN" w:bidi="ar"/>
-              </w:rPr>
-              <w:t>ORM chính thức của Microsoft</w:t>
-            </w:r>
-          </w:p>
-        </w:tc>
-        <w:tc>
-          <w:tcPr>
-            <w:tcW w:w="0" w:type="auto"/>
-            <w:tcBorders>
-              <w:top w:val="single" w:color="4F81BD" w:sz="8" w:space="0"/>
-              <w:left w:val="single" w:color="4F81BD" w:sz="8" w:space="0"/>
-              <w:bottom w:val="single" w:color="4F81BD" w:sz="8" w:space="0"/>
-              <w:right w:val="single" w:color="4F81BD" w:sz="8" w:space="0"/>
-            </w:tcBorders>
-            <w:shd w:val="clear" w:color="auto" w:fill="B8CCE4"/>
-            <w:vAlign w:val="center"/>
-          </w:tcPr>
-          <w:p>
-            <w:pPr>
-              <w:keepNext w:val="0"/>
-              <w:keepLines w:val="0"/>
-              <w:widowControl/>
-              <w:suppressLineNumbers w:val="0"/>
-              <w:jc w:val="center"/>
-              <w:rPr>
-                <w:rFonts w:hint="default" w:ascii="Times New Roman" w:hAnsi="Times New Roman" w:cs="Times New Roman"/>
-                <w:color w:val="000000"/>
-                <w:sz w:val="18"/>
-                <w:szCs w:val="18"/>
-              </w:rPr>
-            </w:pPr>
-            <w:r>
-              <w:rPr>
-                <w:rFonts w:hint="default" w:ascii="Times New Roman" w:hAnsi="Times New Roman" w:eastAsia="SimSun" w:cs="Times New Roman"/>
-                <w:color w:val="000000"/>
-                <w:kern w:val="0"/>
-                <w:sz w:val="22"/>
-                <w:szCs w:val="22"/>
-                <w:lang w:val="en-US" w:eastAsia="zh-CN" w:bidi="ar"/>
-              </w:rPr>
-              <w:t>Dùng để ghi vào SQL cuối ngày</w:t>
-            </w:r>
-          </w:p>
-        </w:tc>
-      </w:tr>
-      <w:tr>
-        <w:tblPrEx>
-          <w:tblBorders>
-            <w:top w:val="none" w:color="auto" w:sz="0" w:space="0"/>
-            <w:left w:val="none" w:color="auto" w:sz="0" w:space="0"/>
-            <w:bottom w:val="none" w:color="auto" w:sz="0" w:space="0"/>
-            <w:right w:val="none" w:color="auto" w:sz="0" w:space="0"/>
-            <w:insideH w:val="none" w:color="auto" w:sz="0" w:space="0"/>
-            <w:insideV w:val="none" w:color="auto" w:sz="0" w:space="0"/>
-          </w:tblBorders>
-          <w:tblCellMar>
-            <w:top w:w="15" w:type="dxa"/>
-            <w:left w:w="15" w:type="dxa"/>
-            <w:bottom w:w="15" w:type="dxa"/>
-            <w:right w:w="15" w:type="dxa"/>
-          </w:tblCellMar>
-        </w:tblPrEx>
-        <w:trPr>
-          <w:tblCellSpacing w:w="15" w:type="dxa"/>
-          <w:jc w:val="center"/>
-        </w:trPr>
-        <w:tc>
-          <w:tcPr>
-            <w:tcW w:w="0" w:type="auto"/>
-            <w:tcBorders>
-              <w:top w:val="single" w:color="4F81BD" w:sz="8" w:space="0"/>
-              <w:left w:val="single" w:color="4F81BD" w:sz="8" w:space="0"/>
-              <w:bottom w:val="single" w:color="4F81BD" w:sz="8" w:space="0"/>
-              <w:right w:val="single" w:color="4F81BD" w:sz="8" w:space="0"/>
-            </w:tcBorders>
-            <w:shd w:val="clear" w:color="auto" w:fill="FFFFFF"/>
-            <w:vAlign w:val="center"/>
-          </w:tcPr>
-          <w:p>
-            <w:pPr>
-              <w:keepNext w:val="0"/>
-              <w:keepLines w:val="0"/>
-              <w:widowControl/>
-              <w:suppressLineNumbers w:val="0"/>
-              <w:jc w:val="center"/>
-              <w:rPr>
-                <w:rFonts w:hint="default" w:ascii="Times New Roman" w:hAnsi="Times New Roman" w:cs="Times New Roman"/>
-                <w:color w:val="000000"/>
-                <w:sz w:val="18"/>
-                <w:szCs w:val="18"/>
-              </w:rPr>
-            </w:pPr>
-            <w:r>
-              <w:rPr>
-                <w:rFonts w:hint="default" w:ascii="Times New Roman" w:hAnsi="Times New Roman" w:eastAsia="SimSun" w:cs="Times New Roman"/>
-                <w:color w:val="000000"/>
-                <w:kern w:val="0"/>
-                <w:sz w:val="22"/>
-                <w:szCs w:val="22"/>
-                <w:lang w:val="en-US" w:eastAsia="zh-CN" w:bidi="ar"/>
-              </w:rPr>
               <w:t>Hangfire</w:t>
             </w:r>
           </w:p>
@@ -3488,6 +3508,7 @@
             <w:insideH w:val="none" w:color="auto" w:sz="0" w:space="0"/>
             <w:insideV w:val="none" w:color="auto" w:sz="0" w:space="0"/>
           </w:tblBorders>
+          <w:shd w:val="clear" w:color="auto" w:fill="auto"/>
           <w:tblCellMar>
             <w:top w:w="15" w:type="dxa"/>
             <w:left w:w="15" w:type="dxa"/>
@@ -4024,6 +4045,7 @@
             <w:insideH w:val="none" w:color="auto" w:sz="0" w:space="0"/>
             <w:insideV w:val="none" w:color="auto" w:sz="0" w:space="0"/>
           </w:tblBorders>
+          <w:shd w:val="clear" w:color="auto" w:fill="auto"/>
           <w:tblCellMar>
             <w:top w:w="15" w:type="dxa"/>
             <w:left w:w="15" w:type="dxa"/>
@@ -4197,6 +4219,7 @@
       <w:pPr>
         <w:pStyle w:val="3"/>
         <w:bidi w:val="0"/>
+        <w:spacing w:before="464" w:beforeAutospacing="0" w:after="0" w:afterAutospacing="0"/>
         <w:rPr>
           <w:rFonts w:hint="default" w:ascii="Times New Roman" w:hAnsi="Times New Roman" w:cs="Times New Roman"/>
         </w:rPr>
@@ -4206,21 +4229,36 @@
           <w:rFonts w:hint="default" w:ascii="Times New Roman" w:hAnsi="Times New Roman" w:cs="Times New Roman"/>
           <w:lang w:val="vi-VN"/>
         </w:rPr>
-        <w:t>Thuật ngữ</w:t>
+        <w:t>B</w:t>
       </w:r>
       <w:r>
         <w:rPr>
           <w:rFonts w:hint="default" w:ascii="Times New Roman" w:hAnsi="Times New Roman" w:cs="Times New Roman"/>
         </w:rPr>
-        <w:t xml:space="preserve"> tiếng Anh hay dùng kèm (bạn sẽ thấy suốt trong công ty lớn)</w:t>
+        <w:t>ảng key Redis</w:t>
       </w:r>
+      <w:r>
+        <w:rPr>
+          <w:rFonts w:hint="default" w:ascii="Times New Roman" w:hAnsi="Times New Roman" w:cs="Times New Roman"/>
+          <w:lang w:val="vi-VN"/>
+        </w:rPr>
+        <w:t xml:space="preserve"> </w:t>
+      </w:r>
+      <w:r>
+        <w:rPr>
+          <w:rFonts w:hint="default" w:ascii="Times New Roman" w:hAnsi="Times New Roman" w:cs="Times New Roman"/>
+        </w:rPr>
+        <w:t>và thuật ngữ quan trọng:</w:t>
+      </w:r>
+      <w:bookmarkStart w:id="0" w:name="_GoBack"/>
+      <w:bookmarkEnd w:id="0"/>
     </w:p>
     <w:tbl>
       <w:tblPr>
         <w:tblStyle w:val="12"/>
-        <w:tblW w:w="4999" w:type="pct"/>
+        <w:tblW w:w="0" w:type="auto"/>
         <w:tblCellSpacing w:w="15" w:type="dxa"/>
-        <w:tblInd w:w="0" w:type="dxa"/>
+        <w:tblInd w:w="20" w:type="dxa"/>
         <w:tblBorders>
           <w:top w:val="none" w:color="auto" w:sz="0" w:space="0"/>
           <w:left w:val="none" w:color="auto" w:sz="0" w:space="0"/>
@@ -4239,856 +4277,9 @@
         </w:tblCellMar>
       </w:tblPr>
       <w:tblGrid>
-        <w:gridCol w:w="2511"/>
-        <w:gridCol w:w="5923"/>
-      </w:tblGrid>
-      <w:tr>
-        <w:tblPrEx>
-          <w:tblBorders>
-            <w:top w:val="none" w:color="auto" w:sz="0" w:space="0"/>
-            <w:left w:val="none" w:color="auto" w:sz="0" w:space="0"/>
-            <w:bottom w:val="none" w:color="auto" w:sz="0" w:space="0"/>
-            <w:right w:val="none" w:color="auto" w:sz="0" w:space="0"/>
-            <w:insideH w:val="none" w:color="auto" w:sz="0" w:space="0"/>
-            <w:insideV w:val="none" w:color="auto" w:sz="0" w:space="0"/>
-          </w:tblBorders>
-          <w:shd w:val="clear" w:color="auto" w:fill="auto"/>
-          <w:tblCellMar>
-            <w:top w:w="15" w:type="dxa"/>
-            <w:left w:w="15" w:type="dxa"/>
-            <w:bottom w:w="15" w:type="dxa"/>
-            <w:right w:w="15" w:type="dxa"/>
-          </w:tblCellMar>
-        </w:tblPrEx>
-        <w:trPr>
-          <w:trHeight w:val="14" w:hRule="atLeast"/>
-          <w:tblHeader/>
-          <w:tblCellSpacing w:w="15" w:type="dxa"/>
-        </w:trPr>
-        <w:tc>
-          <w:tcPr>
-            <w:tcW w:w="1462" w:type="pct"/>
-            <w:tcBorders>
-              <w:top w:val="single" w:color="4F81BD" w:sz="8" w:space="0"/>
-              <w:left w:val="single" w:color="4F81BD" w:sz="8" w:space="0"/>
-              <w:bottom w:val="single" w:color="FFFFFF" w:sz="18" w:space="0"/>
-              <w:right w:val="single" w:color="4F81BD" w:sz="8" w:space="0"/>
-            </w:tcBorders>
-            <w:shd w:val="clear" w:color="auto" w:fill="4F81BD"/>
-            <w:vAlign w:val="center"/>
-          </w:tcPr>
-          <w:p>
-            <w:pPr>
-              <w:keepNext w:val="0"/>
-              <w:keepLines w:val="0"/>
-              <w:widowControl/>
-              <w:suppressLineNumbers w:val="0"/>
-              <w:jc w:val="center"/>
-              <w:rPr>
-                <w:rFonts w:hint="default" w:ascii="Times New Roman" w:hAnsi="Times New Roman" w:cs="Times New Roman"/>
-                <w:b/>
-                <w:bCs/>
-                <w:color w:val="FFFFFF"/>
-              </w:rPr>
-            </w:pPr>
-            <w:r>
-              <w:rPr>
-                <w:rFonts w:hint="default" w:ascii="Times New Roman" w:hAnsi="Times New Roman" w:eastAsia="SimSun" w:cs="Times New Roman"/>
-                <w:b/>
-                <w:bCs/>
-                <w:color w:val="FFFFFF"/>
-                <w:kern w:val="0"/>
-                <w:sz w:val="24"/>
-                <w:szCs w:val="24"/>
-                <w:lang w:val="en-US" w:eastAsia="zh-CN" w:bidi="ar"/>
-              </w:rPr>
-              <w:t>Từ</w:t>
-            </w:r>
-          </w:p>
-        </w:tc>
-        <w:tc>
-          <w:tcPr>
-            <w:tcW w:w="3484" w:type="pct"/>
-            <w:tcBorders>
-              <w:top w:val="single" w:color="4F81BD" w:sz="8" w:space="0"/>
-              <w:left w:val="single" w:color="4F81BD" w:sz="8" w:space="0"/>
-              <w:bottom w:val="single" w:color="FFFFFF" w:sz="18" w:space="0"/>
-              <w:right w:val="single" w:color="4F81BD" w:sz="8" w:space="0"/>
-            </w:tcBorders>
-            <w:shd w:val="clear" w:color="auto" w:fill="4F81BD"/>
-            <w:vAlign w:val="center"/>
-          </w:tcPr>
-          <w:p>
-            <w:pPr>
-              <w:keepNext w:val="0"/>
-              <w:keepLines w:val="0"/>
-              <w:widowControl/>
-              <w:suppressLineNumbers w:val="0"/>
-              <w:jc w:val="center"/>
-              <w:rPr>
-                <w:rFonts w:hint="default" w:ascii="Times New Roman" w:hAnsi="Times New Roman" w:cs="Times New Roman"/>
-                <w:b/>
-                <w:bCs/>
-                <w:color w:val="FFFFFF"/>
-              </w:rPr>
-            </w:pPr>
-            <w:r>
-              <w:rPr>
-                <w:rFonts w:hint="default" w:ascii="Times New Roman" w:hAnsi="Times New Roman" w:eastAsia="SimSun" w:cs="Times New Roman"/>
-                <w:b/>
-                <w:bCs/>
-                <w:color w:val="FFFFFF"/>
-                <w:kern w:val="0"/>
-                <w:sz w:val="24"/>
-                <w:szCs w:val="24"/>
-                <w:lang w:val="en-US" w:eastAsia="zh-CN" w:bidi="ar"/>
-              </w:rPr>
-              <w:t>Nghĩa dễ hiểu</w:t>
-            </w:r>
-          </w:p>
-        </w:tc>
-      </w:tr>
-      <w:tr>
-        <w:tblPrEx>
-          <w:tblBorders>
-            <w:top w:val="none" w:color="auto" w:sz="0" w:space="0"/>
-            <w:left w:val="none" w:color="auto" w:sz="0" w:space="0"/>
-            <w:bottom w:val="none" w:color="auto" w:sz="0" w:space="0"/>
-            <w:right w:val="none" w:color="auto" w:sz="0" w:space="0"/>
-            <w:insideH w:val="none" w:color="auto" w:sz="0" w:space="0"/>
-            <w:insideV w:val="none" w:color="auto" w:sz="0" w:space="0"/>
-          </w:tblBorders>
-          <w:shd w:val="clear" w:color="auto" w:fill="auto"/>
-          <w:tblCellMar>
-            <w:top w:w="15" w:type="dxa"/>
-            <w:left w:w="15" w:type="dxa"/>
-            <w:bottom w:w="15" w:type="dxa"/>
-            <w:right w:w="15" w:type="dxa"/>
-          </w:tblCellMar>
-        </w:tblPrEx>
-        <w:trPr>
-          <w:trHeight w:val="14" w:hRule="atLeast"/>
-          <w:tblCellSpacing w:w="15" w:type="dxa"/>
-        </w:trPr>
-        <w:tc>
-          <w:tcPr>
-            <w:tcW w:w="1462" w:type="pct"/>
-            <w:tcBorders>
-              <w:top w:val="single" w:color="FFFFFF" w:sz="18" w:space="0"/>
-              <w:left w:val="single" w:color="4F81BD" w:sz="8" w:space="0"/>
-              <w:bottom w:val="single" w:color="4F81BD" w:sz="8" w:space="0"/>
-              <w:right w:val="single" w:color="4F81BD" w:sz="8" w:space="0"/>
-            </w:tcBorders>
-            <w:shd w:val="clear" w:color="auto" w:fill="B8CCE4"/>
-            <w:vAlign w:val="center"/>
-          </w:tcPr>
-          <w:p>
-            <w:pPr>
-              <w:keepNext w:val="0"/>
-              <w:keepLines w:val="0"/>
-              <w:widowControl/>
-              <w:suppressLineNumbers w:val="0"/>
-              <w:jc w:val="center"/>
-              <w:rPr>
-                <w:rFonts w:hint="default" w:ascii="Times New Roman" w:hAnsi="Times New Roman" w:cs="Times New Roman"/>
-                <w:color w:val="000000"/>
-              </w:rPr>
-            </w:pPr>
-            <w:r>
-              <w:rPr>
-                <w:rFonts w:hint="default" w:ascii="Times New Roman" w:hAnsi="Times New Roman" w:eastAsia="SimSun" w:cs="Times New Roman"/>
-                <w:color w:val="000000"/>
-                <w:kern w:val="0"/>
-                <w:sz w:val="24"/>
-                <w:szCs w:val="24"/>
-                <w:lang w:val="en-US" w:eastAsia="zh-CN" w:bidi="ar"/>
-              </w:rPr>
-              <w:t>Scale</w:t>
-            </w:r>
-          </w:p>
-        </w:tc>
-        <w:tc>
-          <w:tcPr>
-            <w:tcW w:w="3484" w:type="pct"/>
-            <w:tcBorders>
-              <w:top w:val="single" w:color="FFFFFF" w:sz="18" w:space="0"/>
-              <w:left w:val="single" w:color="4F81BD" w:sz="8" w:space="0"/>
-              <w:bottom w:val="single" w:color="4F81BD" w:sz="8" w:space="0"/>
-              <w:right w:val="single" w:color="4F81BD" w:sz="8" w:space="0"/>
-            </w:tcBorders>
-            <w:shd w:val="clear" w:color="auto" w:fill="B8CCE4"/>
-            <w:vAlign w:val="center"/>
-          </w:tcPr>
-          <w:p>
-            <w:pPr>
-              <w:keepNext w:val="0"/>
-              <w:keepLines w:val="0"/>
-              <w:widowControl/>
-              <w:suppressLineNumbers w:val="0"/>
-              <w:jc w:val="center"/>
-              <w:rPr>
-                <w:rFonts w:hint="default" w:ascii="Times New Roman" w:hAnsi="Times New Roman" w:cs="Times New Roman"/>
-                <w:color w:val="000000"/>
-              </w:rPr>
-            </w:pPr>
-            <w:r>
-              <w:rPr>
-                <w:rFonts w:hint="default" w:ascii="Times New Roman" w:hAnsi="Times New Roman" w:eastAsia="SimSun" w:cs="Times New Roman"/>
-                <w:color w:val="000000"/>
-                <w:kern w:val="0"/>
-                <w:sz w:val="24"/>
-                <w:szCs w:val="24"/>
-                <w:lang w:val="en-US" w:eastAsia="zh-CN" w:bidi="ar"/>
-              </w:rPr>
-              <w:t>Mở rộng được (10 triệu → 100 triệu vẫn ngon)</w:t>
-            </w:r>
-          </w:p>
-        </w:tc>
-      </w:tr>
-      <w:tr>
-        <w:tblPrEx>
-          <w:tblBorders>
-            <w:top w:val="none" w:color="auto" w:sz="0" w:space="0"/>
-            <w:left w:val="none" w:color="auto" w:sz="0" w:space="0"/>
-            <w:bottom w:val="none" w:color="auto" w:sz="0" w:space="0"/>
-            <w:right w:val="none" w:color="auto" w:sz="0" w:space="0"/>
-            <w:insideH w:val="none" w:color="auto" w:sz="0" w:space="0"/>
-            <w:insideV w:val="none" w:color="auto" w:sz="0" w:space="0"/>
-          </w:tblBorders>
-          <w:shd w:val="clear" w:color="auto" w:fill="auto"/>
-          <w:tblCellMar>
-            <w:top w:w="15" w:type="dxa"/>
-            <w:left w:w="15" w:type="dxa"/>
-            <w:bottom w:w="15" w:type="dxa"/>
-            <w:right w:w="15" w:type="dxa"/>
-          </w:tblCellMar>
-        </w:tblPrEx>
-        <w:trPr>
-          <w:trHeight w:val="14" w:hRule="atLeast"/>
-          <w:tblCellSpacing w:w="15" w:type="dxa"/>
-        </w:trPr>
-        <w:tc>
-          <w:tcPr>
-            <w:tcW w:w="1462" w:type="pct"/>
-            <w:tcBorders>
-              <w:top w:val="single" w:color="4F81BD" w:sz="8" w:space="0"/>
-              <w:left w:val="single" w:color="4F81BD" w:sz="8" w:space="0"/>
-              <w:bottom w:val="single" w:color="4F81BD" w:sz="8" w:space="0"/>
-              <w:right w:val="single" w:color="4F81BD" w:sz="8" w:space="0"/>
-            </w:tcBorders>
-            <w:shd w:val="clear" w:color="auto" w:fill="FFFFFF"/>
-            <w:vAlign w:val="center"/>
-          </w:tcPr>
-          <w:p>
-            <w:pPr>
-              <w:keepNext w:val="0"/>
-              <w:keepLines w:val="0"/>
-              <w:widowControl/>
-              <w:suppressLineNumbers w:val="0"/>
-              <w:jc w:val="center"/>
-              <w:rPr>
-                <w:rFonts w:hint="default" w:ascii="Times New Roman" w:hAnsi="Times New Roman" w:cs="Times New Roman"/>
-                <w:color w:val="000000"/>
-              </w:rPr>
-            </w:pPr>
-            <w:r>
-              <w:rPr>
-                <w:rFonts w:hint="default" w:ascii="Times New Roman" w:hAnsi="Times New Roman" w:eastAsia="SimSun" w:cs="Times New Roman"/>
-                <w:color w:val="000000"/>
-                <w:kern w:val="0"/>
-                <w:sz w:val="24"/>
-                <w:szCs w:val="24"/>
-                <w:lang w:val="en-US" w:eastAsia="zh-CN" w:bidi="ar"/>
-              </w:rPr>
-              <w:t>Production-ready</w:t>
-            </w:r>
-          </w:p>
-        </w:tc>
-        <w:tc>
-          <w:tcPr>
-            <w:tcW w:w="3484" w:type="pct"/>
-            <w:tcBorders>
-              <w:top w:val="single" w:color="4F81BD" w:sz="8" w:space="0"/>
-              <w:left w:val="single" w:color="4F81BD" w:sz="8" w:space="0"/>
-              <w:bottom w:val="single" w:color="4F81BD" w:sz="8" w:space="0"/>
-              <w:right w:val="single" w:color="4F81BD" w:sz="8" w:space="0"/>
-            </w:tcBorders>
-            <w:shd w:val="clear" w:color="auto" w:fill="FFFFFF"/>
-            <w:vAlign w:val="center"/>
-          </w:tcPr>
-          <w:p>
-            <w:pPr>
-              <w:keepNext w:val="0"/>
-              <w:keepLines w:val="0"/>
-              <w:widowControl/>
-              <w:suppressLineNumbers w:val="0"/>
-              <w:jc w:val="center"/>
-              <w:rPr>
-                <w:rFonts w:hint="default" w:ascii="Times New Roman" w:hAnsi="Times New Roman" w:cs="Times New Roman"/>
-                <w:color w:val="000000"/>
-              </w:rPr>
-            </w:pPr>
-            <w:r>
-              <w:rPr>
-                <w:rFonts w:hint="default" w:ascii="Times New Roman" w:hAnsi="Times New Roman" w:eastAsia="SimSun" w:cs="Times New Roman"/>
-                <w:color w:val="000000"/>
-                <w:kern w:val="0"/>
-                <w:sz w:val="24"/>
-                <w:szCs w:val="24"/>
-                <w:lang w:val="en-US" w:eastAsia="zh-CN" w:bidi="ar"/>
-              </w:rPr>
-              <w:t>Đã sẵn sàng chạy thật ngoài thị trường</w:t>
-            </w:r>
-          </w:p>
-        </w:tc>
-      </w:tr>
-      <w:tr>
-        <w:tblPrEx>
-          <w:tblBorders>
-            <w:top w:val="none" w:color="auto" w:sz="0" w:space="0"/>
-            <w:left w:val="none" w:color="auto" w:sz="0" w:space="0"/>
-            <w:bottom w:val="none" w:color="auto" w:sz="0" w:space="0"/>
-            <w:right w:val="none" w:color="auto" w:sz="0" w:space="0"/>
-            <w:insideH w:val="none" w:color="auto" w:sz="0" w:space="0"/>
-            <w:insideV w:val="none" w:color="auto" w:sz="0" w:space="0"/>
-          </w:tblBorders>
-          <w:tblCellMar>
-            <w:top w:w="15" w:type="dxa"/>
-            <w:left w:w="15" w:type="dxa"/>
-            <w:bottom w:w="15" w:type="dxa"/>
-            <w:right w:w="15" w:type="dxa"/>
-          </w:tblCellMar>
-        </w:tblPrEx>
-        <w:trPr>
-          <w:trHeight w:val="14" w:hRule="atLeast"/>
-          <w:tblCellSpacing w:w="15" w:type="dxa"/>
-        </w:trPr>
-        <w:tc>
-          <w:tcPr>
-            <w:tcW w:w="1462" w:type="pct"/>
-            <w:tcBorders>
-              <w:top w:val="single" w:color="4F81BD" w:sz="8" w:space="0"/>
-              <w:left w:val="single" w:color="4F81BD" w:sz="8" w:space="0"/>
-              <w:bottom w:val="single" w:color="4F81BD" w:sz="8" w:space="0"/>
-              <w:right w:val="single" w:color="4F81BD" w:sz="8" w:space="0"/>
-            </w:tcBorders>
-            <w:shd w:val="clear" w:color="auto" w:fill="B8CCE4"/>
-            <w:vAlign w:val="center"/>
-          </w:tcPr>
-          <w:p>
-            <w:pPr>
-              <w:keepNext w:val="0"/>
-              <w:keepLines w:val="0"/>
-              <w:widowControl/>
-              <w:suppressLineNumbers w:val="0"/>
-              <w:jc w:val="center"/>
-              <w:rPr>
-                <w:rFonts w:hint="default" w:ascii="Times New Roman" w:hAnsi="Times New Roman" w:cs="Times New Roman"/>
-                <w:color w:val="000000"/>
-              </w:rPr>
-            </w:pPr>
-            <w:r>
-              <w:rPr>
-                <w:rFonts w:hint="default" w:ascii="Times New Roman" w:hAnsi="Times New Roman" w:eastAsia="SimSun" w:cs="Times New Roman"/>
-                <w:color w:val="000000"/>
-                <w:kern w:val="0"/>
-                <w:sz w:val="24"/>
-                <w:szCs w:val="24"/>
-                <w:lang w:val="en-US" w:eastAsia="zh-CN" w:bidi="ar"/>
-              </w:rPr>
-              <w:t>Best practice</w:t>
-            </w:r>
-          </w:p>
-        </w:tc>
-        <w:tc>
-          <w:tcPr>
-            <w:tcW w:w="3484" w:type="pct"/>
-            <w:tcBorders>
-              <w:top w:val="single" w:color="4F81BD" w:sz="8" w:space="0"/>
-              <w:left w:val="single" w:color="4F81BD" w:sz="8" w:space="0"/>
-              <w:bottom w:val="single" w:color="4F81BD" w:sz="8" w:space="0"/>
-              <w:right w:val="single" w:color="4F81BD" w:sz="8" w:space="0"/>
-            </w:tcBorders>
-            <w:shd w:val="clear" w:color="auto" w:fill="B8CCE4"/>
-            <w:vAlign w:val="center"/>
-          </w:tcPr>
-          <w:p>
-            <w:pPr>
-              <w:keepNext w:val="0"/>
-              <w:keepLines w:val="0"/>
-              <w:widowControl/>
-              <w:suppressLineNumbers w:val="0"/>
-              <w:jc w:val="center"/>
-              <w:rPr>
-                <w:rFonts w:hint="default" w:ascii="Times New Roman" w:hAnsi="Times New Roman" w:cs="Times New Roman"/>
-                <w:color w:val="000000"/>
-              </w:rPr>
-            </w:pPr>
-            <w:r>
-              <w:rPr>
-                <w:rFonts w:hint="default" w:ascii="Times New Roman" w:hAnsi="Times New Roman" w:eastAsia="SimSun" w:cs="Times New Roman"/>
-                <w:color w:val="000000"/>
-                <w:kern w:val="0"/>
-                <w:sz w:val="24"/>
-                <w:szCs w:val="24"/>
-                <w:lang w:val="en-US" w:eastAsia="zh-CN" w:bidi="ar"/>
-              </w:rPr>
-              <w:t>Cách làm tốt nhất mà cả thế giới đang dùng</w:t>
-            </w:r>
-          </w:p>
-        </w:tc>
-      </w:tr>
-      <w:tr>
-        <w:tblPrEx>
-          <w:tblBorders>
-            <w:top w:val="none" w:color="auto" w:sz="0" w:space="0"/>
-            <w:left w:val="none" w:color="auto" w:sz="0" w:space="0"/>
-            <w:bottom w:val="none" w:color="auto" w:sz="0" w:space="0"/>
-            <w:right w:val="none" w:color="auto" w:sz="0" w:space="0"/>
-            <w:insideH w:val="none" w:color="auto" w:sz="0" w:space="0"/>
-            <w:insideV w:val="none" w:color="auto" w:sz="0" w:space="0"/>
-          </w:tblBorders>
-          <w:shd w:val="clear" w:color="auto" w:fill="auto"/>
-          <w:tblCellMar>
-            <w:top w:w="15" w:type="dxa"/>
-            <w:left w:w="15" w:type="dxa"/>
-            <w:bottom w:w="15" w:type="dxa"/>
-            <w:right w:w="15" w:type="dxa"/>
-          </w:tblCellMar>
-        </w:tblPrEx>
-        <w:trPr>
-          <w:trHeight w:val="14" w:hRule="atLeast"/>
-          <w:tblCellSpacing w:w="15" w:type="dxa"/>
-        </w:trPr>
-        <w:tc>
-          <w:tcPr>
-            <w:tcW w:w="1462" w:type="pct"/>
-            <w:tcBorders>
-              <w:top w:val="single" w:color="4F81BD" w:sz="8" w:space="0"/>
-              <w:left w:val="single" w:color="4F81BD" w:sz="8" w:space="0"/>
-              <w:bottom w:val="single" w:color="4F81BD" w:sz="8" w:space="0"/>
-              <w:right w:val="single" w:color="4F81BD" w:sz="8" w:space="0"/>
-            </w:tcBorders>
-            <w:shd w:val="clear" w:color="auto" w:fill="FFFFFF"/>
-            <w:vAlign w:val="center"/>
-          </w:tcPr>
-          <w:p>
-            <w:pPr>
-              <w:keepNext w:val="0"/>
-              <w:keepLines w:val="0"/>
-              <w:widowControl/>
-              <w:suppressLineNumbers w:val="0"/>
-              <w:jc w:val="center"/>
-              <w:rPr>
-                <w:rFonts w:hint="default" w:ascii="Times New Roman" w:hAnsi="Times New Roman" w:cs="Times New Roman"/>
-                <w:color w:val="000000"/>
-              </w:rPr>
-            </w:pPr>
-            <w:r>
-              <w:rPr>
-                <w:rFonts w:hint="default" w:ascii="Times New Roman" w:hAnsi="Times New Roman" w:eastAsia="SimSun" w:cs="Times New Roman"/>
-                <w:color w:val="000000"/>
-                <w:kern w:val="0"/>
-                <w:sz w:val="24"/>
-                <w:szCs w:val="24"/>
-                <w:lang w:val="en-US" w:eastAsia="zh-CN" w:bidi="ar"/>
-              </w:rPr>
-              <w:t>Real-time</w:t>
-            </w:r>
-          </w:p>
-        </w:tc>
-        <w:tc>
-          <w:tcPr>
-            <w:tcW w:w="3484" w:type="pct"/>
-            <w:tcBorders>
-              <w:top w:val="single" w:color="4F81BD" w:sz="8" w:space="0"/>
-              <w:left w:val="single" w:color="4F81BD" w:sz="8" w:space="0"/>
-              <w:bottom w:val="single" w:color="4F81BD" w:sz="8" w:space="0"/>
-              <w:right w:val="single" w:color="4F81BD" w:sz="8" w:space="0"/>
-            </w:tcBorders>
-            <w:shd w:val="clear" w:color="auto" w:fill="FFFFFF"/>
-            <w:vAlign w:val="center"/>
-          </w:tcPr>
-          <w:p>
-            <w:pPr>
-              <w:keepNext w:val="0"/>
-              <w:keepLines w:val="0"/>
-              <w:widowControl/>
-              <w:suppressLineNumbers w:val="0"/>
-              <w:jc w:val="center"/>
-              <w:rPr>
-                <w:rFonts w:hint="default" w:ascii="Times New Roman" w:hAnsi="Times New Roman" w:cs="Times New Roman"/>
-                <w:color w:val="000000"/>
-              </w:rPr>
-            </w:pPr>
-            <w:r>
-              <w:rPr>
-                <w:rFonts w:hint="default" w:ascii="Times New Roman" w:hAnsi="Times New Roman" w:eastAsia="SimSun" w:cs="Times New Roman"/>
-                <w:color w:val="000000"/>
-                <w:kern w:val="0"/>
-                <w:sz w:val="24"/>
-                <w:szCs w:val="24"/>
-                <w:lang w:val="en-US" w:eastAsia="zh-CN" w:bidi="ar"/>
-              </w:rPr>
-              <w:t>Theo thời gian thực</w:t>
-            </w:r>
-          </w:p>
-        </w:tc>
-      </w:tr>
-      <w:tr>
-        <w:tblPrEx>
-          <w:tblBorders>
-            <w:top w:val="none" w:color="auto" w:sz="0" w:space="0"/>
-            <w:left w:val="none" w:color="auto" w:sz="0" w:space="0"/>
-            <w:bottom w:val="none" w:color="auto" w:sz="0" w:space="0"/>
-            <w:right w:val="none" w:color="auto" w:sz="0" w:space="0"/>
-            <w:insideH w:val="none" w:color="auto" w:sz="0" w:space="0"/>
-            <w:insideV w:val="none" w:color="auto" w:sz="0" w:space="0"/>
-          </w:tblBorders>
-          <w:tblCellMar>
-            <w:top w:w="15" w:type="dxa"/>
-            <w:left w:w="15" w:type="dxa"/>
-            <w:bottom w:w="15" w:type="dxa"/>
-            <w:right w:w="15" w:type="dxa"/>
-          </w:tblCellMar>
-        </w:tblPrEx>
-        <w:trPr>
-          <w:trHeight w:val="14" w:hRule="atLeast"/>
-          <w:tblCellSpacing w:w="15" w:type="dxa"/>
-        </w:trPr>
-        <w:tc>
-          <w:tcPr>
-            <w:tcW w:w="1462" w:type="pct"/>
-            <w:tcBorders>
-              <w:top w:val="single" w:color="4F81BD" w:sz="8" w:space="0"/>
-              <w:left w:val="single" w:color="4F81BD" w:sz="8" w:space="0"/>
-              <w:bottom w:val="single" w:color="4F81BD" w:sz="8" w:space="0"/>
-              <w:right w:val="single" w:color="4F81BD" w:sz="8" w:space="0"/>
-            </w:tcBorders>
-            <w:shd w:val="clear" w:color="auto" w:fill="B8CCE4"/>
-            <w:vAlign w:val="center"/>
-          </w:tcPr>
-          <w:p>
-            <w:pPr>
-              <w:keepNext w:val="0"/>
-              <w:keepLines w:val="0"/>
-              <w:widowControl/>
-              <w:suppressLineNumbers w:val="0"/>
-              <w:jc w:val="center"/>
-              <w:rPr>
-                <w:rFonts w:hint="default" w:ascii="Times New Roman" w:hAnsi="Times New Roman" w:cs="Times New Roman"/>
-                <w:color w:val="000000"/>
-              </w:rPr>
-            </w:pPr>
-            <w:r>
-              <w:rPr>
-                <w:rFonts w:hint="default" w:ascii="Times New Roman" w:hAnsi="Times New Roman" w:eastAsia="SimSun" w:cs="Times New Roman"/>
-                <w:color w:val="000000"/>
-                <w:kern w:val="0"/>
-                <w:sz w:val="24"/>
-                <w:szCs w:val="24"/>
-                <w:lang w:val="en-US" w:eastAsia="zh-CN" w:bidi="ar"/>
-              </w:rPr>
-              <w:t>Batch</w:t>
-            </w:r>
-          </w:p>
-        </w:tc>
-        <w:tc>
-          <w:tcPr>
-            <w:tcW w:w="3484" w:type="pct"/>
-            <w:tcBorders>
-              <w:top w:val="single" w:color="4F81BD" w:sz="8" w:space="0"/>
-              <w:left w:val="single" w:color="4F81BD" w:sz="8" w:space="0"/>
-              <w:bottom w:val="single" w:color="4F81BD" w:sz="8" w:space="0"/>
-              <w:right w:val="single" w:color="4F81BD" w:sz="8" w:space="0"/>
-            </w:tcBorders>
-            <w:shd w:val="clear" w:color="auto" w:fill="B8CCE4"/>
-            <w:vAlign w:val="center"/>
-          </w:tcPr>
-          <w:p>
-            <w:pPr>
-              <w:keepNext w:val="0"/>
-              <w:keepLines w:val="0"/>
-              <w:widowControl/>
-              <w:suppressLineNumbers w:val="0"/>
-              <w:jc w:val="center"/>
-              <w:rPr>
-                <w:rFonts w:hint="default" w:ascii="Times New Roman" w:hAnsi="Times New Roman" w:cs="Times New Roman"/>
-                <w:color w:val="000000"/>
-              </w:rPr>
-            </w:pPr>
-            <w:r>
-              <w:rPr>
-                <w:rFonts w:hint="default" w:ascii="Times New Roman" w:hAnsi="Times New Roman" w:eastAsia="SimSun" w:cs="Times New Roman"/>
-                <w:color w:val="000000"/>
-                <w:kern w:val="0"/>
-                <w:sz w:val="24"/>
-                <w:szCs w:val="24"/>
-                <w:lang w:val="en-US" w:eastAsia="zh-CN" w:bidi="ar"/>
-              </w:rPr>
-              <w:t>Xử lý theo lô (cuối ngày mới ghi DB)</w:t>
-            </w:r>
-          </w:p>
-        </w:tc>
-      </w:tr>
-      <w:tr>
-        <w:tblPrEx>
-          <w:tblBorders>
-            <w:top w:val="none" w:color="auto" w:sz="0" w:space="0"/>
-            <w:left w:val="none" w:color="auto" w:sz="0" w:space="0"/>
-            <w:bottom w:val="none" w:color="auto" w:sz="0" w:space="0"/>
-            <w:right w:val="none" w:color="auto" w:sz="0" w:space="0"/>
-            <w:insideH w:val="none" w:color="auto" w:sz="0" w:space="0"/>
-            <w:insideV w:val="none" w:color="auto" w:sz="0" w:space="0"/>
-          </w:tblBorders>
-          <w:shd w:val="clear" w:color="auto" w:fill="auto"/>
-          <w:tblCellMar>
-            <w:top w:w="15" w:type="dxa"/>
-            <w:left w:w="15" w:type="dxa"/>
-            <w:bottom w:w="15" w:type="dxa"/>
-            <w:right w:w="15" w:type="dxa"/>
-          </w:tblCellMar>
-        </w:tblPrEx>
-        <w:trPr>
-          <w:trHeight w:val="14" w:hRule="atLeast"/>
-          <w:tblCellSpacing w:w="15" w:type="dxa"/>
-        </w:trPr>
-        <w:tc>
-          <w:tcPr>
-            <w:tcW w:w="1462" w:type="pct"/>
-            <w:tcBorders>
-              <w:top w:val="single" w:color="4F81BD" w:sz="8" w:space="0"/>
-              <w:left w:val="single" w:color="4F81BD" w:sz="8" w:space="0"/>
-              <w:bottom w:val="single" w:color="4F81BD" w:sz="8" w:space="0"/>
-              <w:right w:val="single" w:color="4F81BD" w:sz="8" w:space="0"/>
-            </w:tcBorders>
-            <w:shd w:val="clear" w:color="auto" w:fill="FFFFFF"/>
-            <w:vAlign w:val="center"/>
-          </w:tcPr>
-          <w:p>
-            <w:pPr>
-              <w:keepNext w:val="0"/>
-              <w:keepLines w:val="0"/>
-              <w:widowControl/>
-              <w:suppressLineNumbers w:val="0"/>
-              <w:jc w:val="center"/>
-              <w:rPr>
-                <w:rFonts w:hint="default" w:ascii="Times New Roman" w:hAnsi="Times New Roman" w:cs="Times New Roman"/>
-                <w:color w:val="000000"/>
-              </w:rPr>
-            </w:pPr>
-            <w:r>
-              <w:rPr>
-                <w:rFonts w:hint="default" w:ascii="Times New Roman" w:hAnsi="Times New Roman" w:eastAsia="SimSun" w:cs="Times New Roman"/>
-                <w:color w:val="000000"/>
-                <w:kern w:val="0"/>
-                <w:sz w:val="24"/>
-                <w:szCs w:val="24"/>
-                <w:lang w:val="en-US" w:eastAsia="zh-CN" w:bidi="ar"/>
-              </w:rPr>
-              <w:t>Cleanup / Clean up</w:t>
-            </w:r>
-          </w:p>
-        </w:tc>
-        <w:tc>
-          <w:tcPr>
-            <w:tcW w:w="3484" w:type="pct"/>
-            <w:tcBorders>
-              <w:top w:val="single" w:color="4F81BD" w:sz="8" w:space="0"/>
-              <w:left w:val="single" w:color="4F81BD" w:sz="8" w:space="0"/>
-              <w:bottom w:val="single" w:color="4F81BD" w:sz="8" w:space="0"/>
-              <w:right w:val="single" w:color="4F81BD" w:sz="8" w:space="0"/>
-            </w:tcBorders>
-            <w:shd w:val="clear" w:color="auto" w:fill="FFFFFF"/>
-            <w:vAlign w:val="center"/>
-          </w:tcPr>
-          <w:p>
-            <w:pPr>
-              <w:keepNext w:val="0"/>
-              <w:keepLines w:val="0"/>
-              <w:widowControl/>
-              <w:suppressLineNumbers w:val="0"/>
-              <w:jc w:val="center"/>
-              <w:rPr>
-                <w:rFonts w:hint="default" w:ascii="Times New Roman" w:hAnsi="Times New Roman" w:cs="Times New Roman"/>
-                <w:color w:val="000000"/>
-              </w:rPr>
-            </w:pPr>
-            <w:r>
-              <w:rPr>
-                <w:rFonts w:hint="default" w:ascii="Times New Roman" w:hAnsi="Times New Roman" w:eastAsia="SimSun" w:cs="Times New Roman"/>
-                <w:color w:val="000000"/>
-                <w:kern w:val="0"/>
-                <w:sz w:val="24"/>
-                <w:szCs w:val="24"/>
-                <w:lang w:val="en-US" w:eastAsia="zh-CN" w:bidi="ar"/>
-              </w:rPr>
-              <w:t>Dọn rác (xóa key Redis cũ)</w:t>
-            </w:r>
-          </w:p>
-        </w:tc>
-      </w:tr>
-      <w:tr>
-        <w:tblPrEx>
-          <w:tblBorders>
-            <w:top w:val="none" w:color="auto" w:sz="0" w:space="0"/>
-            <w:left w:val="none" w:color="auto" w:sz="0" w:space="0"/>
-            <w:bottom w:val="none" w:color="auto" w:sz="0" w:space="0"/>
-            <w:right w:val="none" w:color="auto" w:sz="0" w:space="0"/>
-            <w:insideH w:val="none" w:color="auto" w:sz="0" w:space="0"/>
-            <w:insideV w:val="none" w:color="auto" w:sz="0" w:space="0"/>
-          </w:tblBorders>
-          <w:shd w:val="clear" w:color="auto" w:fill="auto"/>
-          <w:tblCellMar>
-            <w:top w:w="15" w:type="dxa"/>
-            <w:left w:w="15" w:type="dxa"/>
-            <w:bottom w:w="15" w:type="dxa"/>
-            <w:right w:w="15" w:type="dxa"/>
-          </w:tblCellMar>
-        </w:tblPrEx>
-        <w:trPr>
-          <w:trHeight w:val="14" w:hRule="atLeast"/>
-          <w:tblCellSpacing w:w="15" w:type="dxa"/>
-        </w:trPr>
-        <w:tc>
-          <w:tcPr>
-            <w:tcW w:w="1462" w:type="pct"/>
-            <w:tcBorders>
-              <w:top w:val="single" w:color="4F81BD" w:sz="8" w:space="0"/>
-              <w:left w:val="single" w:color="4F81BD" w:sz="8" w:space="0"/>
-              <w:bottom w:val="single" w:color="4F81BD" w:sz="8" w:space="0"/>
-              <w:right w:val="single" w:color="4F81BD" w:sz="8" w:space="0"/>
-            </w:tcBorders>
-            <w:shd w:val="clear" w:color="auto" w:fill="B8CCE4"/>
-            <w:vAlign w:val="center"/>
-          </w:tcPr>
-          <w:p>
-            <w:pPr>
-              <w:keepNext w:val="0"/>
-              <w:keepLines w:val="0"/>
-              <w:widowControl/>
-              <w:suppressLineNumbers w:val="0"/>
-              <w:jc w:val="center"/>
-              <w:rPr>
-                <w:rFonts w:hint="default" w:ascii="Times New Roman" w:hAnsi="Times New Roman" w:cs="Times New Roman"/>
-                <w:color w:val="000000"/>
-              </w:rPr>
-            </w:pPr>
-            <w:r>
-              <w:rPr>
-                <w:rFonts w:hint="default" w:ascii="Times New Roman" w:hAnsi="Times New Roman" w:eastAsia="SimSun" w:cs="Times New Roman"/>
-                <w:color w:val="000000"/>
-                <w:kern w:val="0"/>
-                <w:sz w:val="24"/>
-                <w:szCs w:val="24"/>
-                <w:lang w:val="en-US" w:eastAsia="zh-CN" w:bidi="ar"/>
-              </w:rPr>
-              <w:t>Idempotent</w:t>
-            </w:r>
-          </w:p>
-        </w:tc>
-        <w:tc>
-          <w:tcPr>
-            <w:tcW w:w="3484" w:type="pct"/>
-            <w:tcBorders>
-              <w:top w:val="single" w:color="4F81BD" w:sz="8" w:space="0"/>
-              <w:left w:val="single" w:color="4F81BD" w:sz="8" w:space="0"/>
-              <w:bottom w:val="single" w:color="4F81BD" w:sz="8" w:space="0"/>
-              <w:right w:val="single" w:color="4F81BD" w:sz="8" w:space="0"/>
-            </w:tcBorders>
-            <w:shd w:val="clear" w:color="auto" w:fill="B8CCE4"/>
-            <w:vAlign w:val="center"/>
-          </w:tcPr>
-          <w:p>
-            <w:pPr>
-              <w:keepNext w:val="0"/>
-              <w:keepLines w:val="0"/>
-              <w:widowControl/>
-              <w:suppressLineNumbers w:val="0"/>
-              <w:jc w:val="center"/>
-              <w:rPr>
-                <w:rFonts w:hint="default" w:ascii="Times New Roman" w:hAnsi="Times New Roman" w:cs="Times New Roman"/>
-                <w:color w:val="000000"/>
-              </w:rPr>
-            </w:pPr>
-            <w:r>
-              <w:rPr>
-                <w:rFonts w:hint="default" w:ascii="Times New Roman" w:hAnsi="Times New Roman" w:eastAsia="SimSun" w:cs="Times New Roman"/>
-                <w:color w:val="000000"/>
-                <w:kern w:val="0"/>
-                <w:sz w:val="24"/>
-                <w:szCs w:val="24"/>
-                <w:lang w:val="en-US" w:eastAsia="zh-CN" w:bidi="ar"/>
-              </w:rPr>
-              <w:t>Chạy bao nhiêu lần cũng cho cùng 1 kết quả</w:t>
-            </w:r>
-          </w:p>
-        </w:tc>
-      </w:tr>
-    </w:tbl>
-    <w:p>
-      <w:pPr>
-        <w:jc w:val="both"/>
-        <w:rPr>
-          <w:rFonts w:hint="default" w:ascii="Times New Roman" w:hAnsi="Times New Roman" w:cs="Times New Roman"/>
-          <w:lang w:val="vi-VN"/>
-        </w:rPr>
-      </w:pPr>
-    </w:p>
-    <w:p>
-      <w:pPr>
-        <w:pStyle w:val="3"/>
-        <w:bidi w:val="0"/>
-        <w:rPr>
-          <w:rFonts w:hint="default" w:ascii="Times New Roman" w:hAnsi="Times New Roman" w:cs="Times New Roman"/>
-        </w:rPr>
-      </w:pPr>
-      <w:r>
-        <w:rPr>
-          <w:rFonts w:hint="default" w:ascii="Times New Roman" w:hAnsi="Times New Roman" w:cs="Times New Roman"/>
-        </w:rPr>
-        <w:br w:type="page"/>
-      </w:r>
-      <w:r>
-        <w:rPr>
-          <w:rFonts w:hint="default" w:ascii="Times New Roman" w:hAnsi="Times New Roman" w:cs="Times New Roman"/>
-          <w:lang w:val="vi-VN"/>
-        </w:rPr>
-        <w:t>B</w:t>
-      </w:r>
-      <w:r>
-        <w:rPr>
-          <w:rFonts w:hint="default" w:ascii="Times New Roman" w:hAnsi="Times New Roman" w:cs="Times New Roman"/>
-        </w:rPr>
-        <w:t>ảng tóm tắt key và thuật ngữ quan trọng trong Redis, ngắn gọn, dễ nhớ và rõ ràng:</w:t>
-      </w:r>
-    </w:p>
-    <w:tbl>
-      <w:tblPr>
-        <w:tblW w:w="0" w:type="auto"/>
-        <w:tblCellSpacing w:w="15" w:type="dxa"/>
-        <w:tblInd w:w="20" w:type="dxa"/>
-        <w:tblBorders>
-          <w:top w:val="none" w:color="auto" w:sz="0" w:space="0"/>
-          <w:left w:val="none" w:color="auto" w:sz="0" w:space="0"/>
-          <w:bottom w:val="none" w:color="auto" w:sz="0" w:space="0"/>
-          <w:right w:val="none" w:color="auto" w:sz="0" w:space="0"/>
-          <w:insideH w:val="none" w:color="auto" w:sz="0" w:space="0"/>
-          <w:insideV w:val="none" w:color="auto" w:sz="0" w:space="0"/>
-        </w:tblBorders>
-        <w:shd w:val="clear"/>
-        <w:tblLayout w:type="autofit"/>
-        <w:tblCellMar>
-          <w:top w:w="15" w:type="dxa"/>
-          <w:left w:w="15" w:type="dxa"/>
-          <w:bottom w:w="15" w:type="dxa"/>
-          <w:right w:w="15" w:type="dxa"/>
-        </w:tblCellMar>
-      </w:tblPr>
-      <w:tblGrid>
-        <w:gridCol w:w="1733"/>
-        <w:gridCol w:w="3336"/>
-        <w:gridCol w:w="3367"/>
+        <w:gridCol w:w="1730"/>
+        <w:gridCol w:w="3329"/>
+        <w:gridCol w:w="3357"/>
       </w:tblGrid>
       <w:tr>
         <w:tblPrEx>
@@ -5129,6 +4320,7 @@
               <w:keepLines w:val="0"/>
               <w:widowControl/>
               <w:suppressLineNumbers w:val="0"/>
+              <w:spacing w:beforeAutospacing="0"/>
               <w:jc w:val="center"/>
               <w:rPr>
                 <w:rFonts w:hint="default" w:ascii="Times New Roman" w:hAnsi="Times New Roman" w:cs="Times New Roman"/>
@@ -5245,6 +4437,7 @@
             <w:insideH w:val="none" w:color="auto" w:sz="0" w:space="0"/>
             <w:insideV w:val="none" w:color="auto" w:sz="0" w:space="0"/>
           </w:tblBorders>
+          <w:shd w:val="clear" w:color="auto" w:fill="auto"/>
           <w:tblCellMar>
             <w:top w:w="15" w:type="dxa"/>
             <w:left w:w="15" w:type="dxa"/>
@@ -5378,6 +4571,7 @@
             <w:insideH w:val="none" w:color="auto" w:sz="0" w:space="0"/>
             <w:insideV w:val="none" w:color="auto" w:sz="0" w:space="0"/>
           </w:tblBorders>
+          <w:shd w:val="clear" w:color="auto" w:fill="auto"/>
           <w:tblCellMar>
             <w:top w:w="15" w:type="dxa"/>
             <w:left w:w="15" w:type="dxa"/>
@@ -5511,6 +4705,7 @@
             <w:insideH w:val="none" w:color="auto" w:sz="0" w:space="0"/>
             <w:insideV w:val="none" w:color="auto" w:sz="0" w:space="0"/>
           </w:tblBorders>
+          <w:shd w:val="clear" w:color="auto" w:fill="auto"/>
           <w:tblCellMar>
             <w:top w:w="15" w:type="dxa"/>
             <w:left w:w="15" w:type="dxa"/>
@@ -5644,7 +4839,7 @@
             <w:insideH w:val="none" w:color="auto" w:sz="0" w:space="0"/>
             <w:insideV w:val="none" w:color="auto" w:sz="0" w:space="0"/>
           </w:tblBorders>
-          <w:shd w:val="clear"/>
+          <w:shd w:val="clear" w:color="auto" w:fill="auto"/>
           <w:tblCellMar>
             <w:top w:w="15" w:type="dxa"/>
             <w:left w:w="15" w:type="dxa"/>
@@ -5778,6 +4973,7 @@
             <w:insideH w:val="none" w:color="auto" w:sz="0" w:space="0"/>
             <w:insideV w:val="none" w:color="auto" w:sz="0" w:space="0"/>
           </w:tblBorders>
+          <w:shd w:val="clear" w:color="auto" w:fill="auto"/>
           <w:tblCellMar>
             <w:top w:w="15" w:type="dxa"/>
             <w:left w:w="15" w:type="dxa"/>
@@ -5911,6 +5107,7 @@
             <w:insideH w:val="none" w:color="auto" w:sz="0" w:space="0"/>
             <w:insideV w:val="none" w:color="auto" w:sz="0" w:space="0"/>
           </w:tblBorders>
+          <w:shd w:val="clear" w:color="auto" w:fill="auto"/>
           <w:tblCellMar>
             <w:top w:w="15" w:type="dxa"/>
             <w:left w:w="15" w:type="dxa"/>
@@ -6044,6 +5241,7 @@
             <w:insideH w:val="none" w:color="auto" w:sz="0" w:space="0"/>
             <w:insideV w:val="none" w:color="auto" w:sz="0" w:space="0"/>
           </w:tblBorders>
+          <w:shd w:val="clear" w:color="auto" w:fill="auto"/>
           <w:tblCellMar>
             <w:top w:w="15" w:type="dxa"/>
             <w:left w:w="15" w:type="dxa"/>
@@ -6177,6 +5375,7 @@
             <w:insideH w:val="none" w:color="auto" w:sz="0" w:space="0"/>
             <w:insideV w:val="none" w:color="auto" w:sz="0" w:space="0"/>
           </w:tblBorders>
+          <w:shd w:val="clear" w:color="auto" w:fill="auto"/>
           <w:tblCellMar>
             <w:top w:w="15" w:type="dxa"/>
             <w:left w:w="15" w:type="dxa"/>
@@ -6358,6 +5557,7 @@
             <w:insideH w:val="none" w:color="auto" w:sz="0" w:space="0"/>
             <w:insideV w:val="none" w:color="auto" w:sz="0" w:space="0"/>
           </w:tblBorders>
+          <w:shd w:val="clear" w:color="auto" w:fill="auto"/>
           <w:tblCellMar>
             <w:top w:w="15" w:type="dxa"/>
             <w:left w:w="15" w:type="dxa"/>
@@ -6491,7 +5691,7 @@
             <w:insideH w:val="none" w:color="auto" w:sz="0" w:space="0"/>
             <w:insideV w:val="none" w:color="auto" w:sz="0" w:space="0"/>
           </w:tblBorders>
-          <w:shd w:val="clear"/>
+          <w:shd w:val="clear" w:color="auto" w:fill="auto"/>
           <w:tblCellMar>
             <w:top w:w="15" w:type="dxa"/>
             <w:left w:w="15" w:type="dxa"/>
@@ -6625,6 +5825,7 @@
             <w:insideH w:val="none" w:color="auto" w:sz="0" w:space="0"/>
             <w:insideV w:val="none" w:color="auto" w:sz="0" w:space="0"/>
           </w:tblBorders>
+          <w:shd w:val="clear" w:color="auto" w:fill="auto"/>
           <w:tblCellMar>
             <w:top w:w="15" w:type="dxa"/>
             <w:left w:w="15" w:type="dxa"/>
@@ -6757,8 +5958,6 @@
           <w:lang w:val="vi-VN"/>
         </w:rPr>
       </w:pPr>
-      <w:bookmarkStart w:id="0" w:name="_GoBack"/>
-      <w:bookmarkEnd w:id="0"/>
     </w:p>
     <w:sectPr>
       <w:pgSz w:w="11906" w:h="16838"/>
@@ -7021,146 +6220,146 @@
     <w:lsdException w:qFormat="1" w:uiPriority="0" w:name="heading 7"/>
     <w:lsdException w:qFormat="1" w:uiPriority="0" w:name="heading 8"/>
     <w:lsdException w:qFormat="1" w:uiPriority="0" w:name="heading 9"/>
-    <w:lsdException w:unhideWhenUsed="0" w:uiPriority="0" w:semiHidden="0" w:name="index 1"/>
+    <w:lsdException w:qFormat="1" w:unhideWhenUsed="0" w:uiPriority="0" w:semiHidden="0" w:name="index 1"/>
     <w:lsdException w:qFormat="1" w:unhideWhenUsed="0" w:uiPriority="0" w:semiHidden="0" w:name="index 2"/>
-    <w:lsdException w:unhideWhenUsed="0" w:uiPriority="0" w:semiHidden="0" w:name="index 3"/>
+    <w:lsdException w:qFormat="1" w:unhideWhenUsed="0" w:uiPriority="0" w:semiHidden="0" w:name="index 3"/>
     <w:lsdException w:unhideWhenUsed="0" w:uiPriority="0" w:semiHidden="0" w:name="index 4"/>
-    <w:lsdException w:unhideWhenUsed="0" w:uiPriority="0" w:semiHidden="0" w:name="index 5"/>
+    <w:lsdException w:qFormat="1" w:unhideWhenUsed="0" w:uiPriority="0" w:semiHidden="0" w:name="index 5"/>
     <w:lsdException w:qFormat="1" w:unhideWhenUsed="0" w:uiPriority="0" w:semiHidden="0" w:name="index 6"/>
     <w:lsdException w:qFormat="1" w:unhideWhenUsed="0" w:uiPriority="0" w:semiHidden="0" w:name="index 7"/>
     <w:lsdException w:unhideWhenUsed="0" w:uiPriority="0" w:semiHidden="0" w:name="index 8"/>
-    <w:lsdException w:unhideWhenUsed="0" w:uiPriority="0" w:semiHidden="0" w:name="index 9"/>
-    <w:lsdException w:unhideWhenUsed="0" w:uiPriority="0" w:semiHidden="0" w:name="toc 1"/>
+    <w:lsdException w:qFormat="1" w:unhideWhenUsed="0" w:uiPriority="0" w:semiHidden="0" w:name="index 9"/>
+    <w:lsdException w:qFormat="1" w:unhideWhenUsed="0" w:uiPriority="0" w:semiHidden="0" w:name="toc 1"/>
     <w:lsdException w:qFormat="1" w:unhideWhenUsed="0" w:uiPriority="0" w:semiHidden="0" w:name="toc 2"/>
-    <w:lsdException w:unhideWhenUsed="0" w:uiPriority="0" w:semiHidden="0" w:name="toc 3"/>
+    <w:lsdException w:qFormat="1" w:unhideWhenUsed="0" w:uiPriority="0" w:semiHidden="0" w:name="toc 3"/>
     <w:lsdException w:qFormat="1" w:unhideWhenUsed="0" w:uiPriority="0" w:semiHidden="0" w:name="toc 4"/>
     <w:lsdException w:qFormat="1" w:unhideWhenUsed="0" w:uiPriority="0" w:semiHidden="0" w:name="toc 5"/>
     <w:lsdException w:qFormat="1" w:unhideWhenUsed="0" w:uiPriority="0" w:semiHidden="0" w:name="toc 6"/>
     <w:lsdException w:qFormat="1" w:unhideWhenUsed="0" w:uiPriority="0" w:semiHidden="0" w:name="toc 7"/>
     <w:lsdException w:qFormat="1" w:unhideWhenUsed="0" w:uiPriority="0" w:semiHidden="0" w:name="toc 8"/>
     <w:lsdException w:unhideWhenUsed="0" w:uiPriority="0" w:semiHidden="0" w:name="toc 9"/>
-    <w:lsdException w:unhideWhenUsed="0" w:uiPriority="0" w:semiHidden="0" w:name="Normal Indent"/>
+    <w:lsdException w:qFormat="1" w:unhideWhenUsed="0" w:uiPriority="0" w:semiHidden="0" w:name="Normal Indent"/>
     <w:lsdException w:unhideWhenUsed="0" w:uiPriority="0" w:semiHidden="0" w:name="footnote text"/>
-    <w:lsdException w:unhideWhenUsed="0" w:uiPriority="0" w:semiHidden="0" w:name="annotation text"/>
+    <w:lsdException w:qFormat="1" w:unhideWhenUsed="0" w:uiPriority="0" w:semiHidden="0" w:name="annotation text"/>
     <w:lsdException w:qFormat="1" w:unhideWhenUsed="0" w:uiPriority="0" w:semiHidden="0" w:name="header"/>
-    <w:lsdException w:unhideWhenUsed="0" w:uiPriority="0" w:semiHidden="0" w:name="footer"/>
-    <w:lsdException w:unhideWhenUsed="0" w:uiPriority="0" w:semiHidden="0" w:name="index heading"/>
+    <w:lsdException w:qFormat="1" w:unhideWhenUsed="0" w:uiPriority="0" w:semiHidden="0" w:name="footer"/>
+    <w:lsdException w:qFormat="1" w:unhideWhenUsed="0" w:uiPriority="0" w:semiHidden="0" w:name="index heading"/>
     <w:lsdException w:qFormat="1" w:uiPriority="0" w:name="caption"/>
-    <w:lsdException w:unhideWhenUsed="0" w:uiPriority="0" w:semiHidden="0" w:name="table of figures"/>
+    <w:lsdException w:qFormat="1" w:unhideWhenUsed="0" w:uiPriority="0" w:semiHidden="0" w:name="table of figures"/>
     <w:lsdException w:qFormat="1" w:unhideWhenUsed="0" w:uiPriority="0" w:semiHidden="0" w:name="envelope address"/>
     <w:lsdException w:qFormat="1" w:unhideWhenUsed="0" w:uiPriority="0" w:semiHidden="0" w:name="envelope return"/>
     <w:lsdException w:qFormat="1" w:unhideWhenUsed="0" w:uiPriority="0" w:semiHidden="0" w:name="footnote reference"/>
     <w:lsdException w:unhideWhenUsed="0" w:uiPriority="0" w:semiHidden="0" w:name="annotation reference"/>
     <w:lsdException w:unhideWhenUsed="0" w:uiPriority="0" w:semiHidden="0" w:name="line number"/>
     <w:lsdException w:unhideWhenUsed="0" w:uiPriority="0" w:semiHidden="0" w:name="page number"/>
-    <w:lsdException w:unhideWhenUsed="0" w:uiPriority="0" w:semiHidden="0" w:name="endnote reference"/>
-    <w:lsdException w:unhideWhenUsed="0" w:uiPriority="0" w:semiHidden="0" w:name="endnote text"/>
-    <w:lsdException w:unhideWhenUsed="0" w:uiPriority="0" w:semiHidden="0" w:name="table of authorities"/>
-    <w:lsdException w:unhideWhenUsed="0" w:uiPriority="0" w:semiHidden="0" w:name="macro"/>
+    <w:lsdException w:qFormat="1" w:unhideWhenUsed="0" w:uiPriority="0" w:semiHidden="0" w:name="endnote reference"/>
+    <w:lsdException w:qFormat="1" w:unhideWhenUsed="0" w:uiPriority="0" w:semiHidden="0" w:name="endnote text"/>
+    <w:lsdException w:qFormat="1" w:unhideWhenUsed="0" w:uiPriority="0" w:semiHidden="0" w:name="table of authorities"/>
+    <w:lsdException w:qFormat="1" w:unhideWhenUsed="0" w:uiPriority="0" w:semiHidden="0" w:name="macro"/>
     <w:lsdException w:qFormat="1" w:unhideWhenUsed="0" w:uiPriority="0" w:semiHidden="0" w:name="toa heading"/>
     <w:lsdException w:qFormat="1" w:unhideWhenUsed="0" w:uiPriority="0" w:semiHidden="0" w:name="List"/>
-    <w:lsdException w:unhideWhenUsed="0" w:uiPriority="0" w:semiHidden="0" w:name="List Bullet"/>
-    <w:lsdException w:unhideWhenUsed="0" w:uiPriority="0" w:semiHidden="0" w:name="List Number"/>
-    <w:lsdException w:unhideWhenUsed="0" w:uiPriority="0" w:semiHidden="0" w:name="List 2"/>
+    <w:lsdException w:qFormat="1" w:unhideWhenUsed="0" w:uiPriority="0" w:semiHidden="0" w:name="List Bullet"/>
+    <w:lsdException w:qFormat="1" w:unhideWhenUsed="0" w:uiPriority="0" w:semiHidden="0" w:name="List Number"/>
+    <w:lsdException w:qFormat="1" w:unhideWhenUsed="0" w:uiPriority="0" w:semiHidden="0" w:name="List 2"/>
     <w:lsdException w:unhideWhenUsed="0" w:uiPriority="0" w:semiHidden="0" w:name="List 3"/>
-    <w:lsdException w:unhideWhenUsed="0" w:uiPriority="0" w:semiHidden="0" w:name="List 4"/>
+    <w:lsdException w:qFormat="1" w:unhideWhenUsed="0" w:uiPriority="0" w:semiHidden="0" w:name="List 4"/>
     <w:lsdException w:qFormat="1" w:unhideWhenUsed="0" w:uiPriority="0" w:semiHidden="0" w:name="List 5"/>
-    <w:lsdException w:unhideWhenUsed="0" w:uiPriority="0" w:semiHidden="0" w:name="List Bullet 2"/>
+    <w:lsdException w:qFormat="1" w:unhideWhenUsed="0" w:uiPriority="0" w:semiHidden="0" w:name="List Bullet 2"/>
     <w:lsdException w:qFormat="1" w:unhideWhenUsed="0" w:uiPriority="0" w:semiHidden="0" w:name="List Bullet 3"/>
-    <w:lsdException w:unhideWhenUsed="0" w:uiPriority="0" w:semiHidden="0" w:name="List Bullet 4"/>
+    <w:lsdException w:qFormat="1" w:unhideWhenUsed="0" w:uiPriority="0" w:semiHidden="0" w:name="List Bullet 4"/>
     <w:lsdException w:qFormat="1" w:unhideWhenUsed="0" w:uiPriority="0" w:semiHidden="0" w:name="List Bullet 5"/>
-    <w:lsdException w:unhideWhenUsed="0" w:uiPriority="0" w:semiHidden="0" w:name="List Number 2"/>
-    <w:lsdException w:unhideWhenUsed="0" w:uiPriority="0" w:semiHidden="0" w:name="List Number 3"/>
-    <w:lsdException w:unhideWhenUsed="0" w:uiPriority="0" w:semiHidden="0" w:name="List Number 4"/>
+    <w:lsdException w:qFormat="1" w:unhideWhenUsed="0" w:uiPriority="0" w:semiHidden="0" w:name="List Number 2"/>
+    <w:lsdException w:qFormat="1" w:unhideWhenUsed="0" w:uiPriority="0" w:semiHidden="0" w:name="List Number 3"/>
+    <w:lsdException w:qFormat="1" w:unhideWhenUsed="0" w:uiPriority="0" w:semiHidden="0" w:name="List Number 4"/>
     <w:lsdException w:qFormat="1" w:unhideWhenUsed="0" w:uiPriority="0" w:semiHidden="0" w:name="List Number 5"/>
     <w:lsdException w:qFormat="1" w:unhideWhenUsed="0" w:uiPriority="0" w:semiHidden="0" w:name="Title"/>
-    <w:lsdException w:unhideWhenUsed="0" w:uiPriority="0" w:semiHidden="0" w:name="Closing"/>
+    <w:lsdException w:qFormat="1" w:unhideWhenUsed="0" w:uiPriority="0" w:semiHidden="0" w:name="Closing"/>
     <w:lsdException w:qFormat="1" w:unhideWhenUsed="0" w:uiPriority="0" w:semiHidden="0" w:name="Signature"/>
     <w:lsdException w:unhideWhenUsed="0" w:uiPriority="0" w:name="Default Paragraph Font"/>
     <w:lsdException w:unhideWhenUsed="0" w:uiPriority="0" w:semiHidden="0" w:name="Body Text"/>
     <w:lsdException w:qFormat="1" w:unhideWhenUsed="0" w:uiPriority="0" w:semiHidden="0" w:name="Body Text Indent"/>
-    <w:lsdException w:unhideWhenUsed="0" w:uiPriority="0" w:semiHidden="0" w:name="List Continue"/>
+    <w:lsdException w:qFormat="1" w:unhideWhenUsed="0" w:uiPriority="0" w:semiHidden="0" w:name="List Continue"/>
     <w:lsdException w:unhideWhenUsed="0" w:uiPriority="0" w:semiHidden="0" w:name="List Continue 2"/>
     <w:lsdException w:qFormat="1" w:unhideWhenUsed="0" w:uiPriority="0" w:semiHidden="0" w:name="List Continue 3"/>
-    <w:lsdException w:unhideWhenUsed="0" w:uiPriority="0" w:semiHidden="0" w:name="List Continue 4"/>
-    <w:lsdException w:unhideWhenUsed="0" w:uiPriority="0" w:semiHidden="0" w:name="List Continue 5"/>
+    <w:lsdException w:qFormat="1" w:unhideWhenUsed="0" w:uiPriority="0" w:semiHidden="0" w:name="List Continue 4"/>
+    <w:lsdException w:qFormat="1" w:unhideWhenUsed="0" w:uiPriority="0" w:semiHidden="0" w:name="List Continue 5"/>
     <w:lsdException w:qFormat="1" w:unhideWhenUsed="0" w:uiPriority="0" w:semiHidden="0" w:name="Message Header"/>
     <w:lsdException w:qFormat="1" w:unhideWhenUsed="0" w:uiPriority="0" w:semiHidden="0" w:name="Subtitle"/>
     <w:lsdException w:unhideWhenUsed="0" w:uiPriority="0" w:semiHidden="0" w:name="Salutation"/>
-    <w:lsdException w:unhideWhenUsed="0" w:uiPriority="0" w:semiHidden="0" w:name="Date"/>
-    <w:lsdException w:unhideWhenUsed="0" w:uiPriority="0" w:semiHidden="0" w:name="Body Text First Indent"/>
+    <w:lsdException w:qFormat="1" w:unhideWhenUsed="0" w:uiPriority="0" w:semiHidden="0" w:name="Date"/>
+    <w:lsdException w:qFormat="1" w:unhideWhenUsed="0" w:uiPriority="0" w:semiHidden="0" w:name="Body Text First Indent"/>
     <w:lsdException w:unhideWhenUsed="0" w:uiPriority="0" w:semiHidden="0" w:name="Body Text First Indent 2"/>
-    <w:lsdException w:unhideWhenUsed="0" w:uiPriority="0" w:semiHidden="0" w:name="Note Heading"/>
+    <w:lsdException w:qFormat="1" w:unhideWhenUsed="0" w:uiPriority="0" w:semiHidden="0" w:name="Note Heading"/>
     <w:lsdException w:qFormat="1" w:unhideWhenUsed="0" w:uiPriority="0" w:semiHidden="0" w:name="Body Text 2"/>
     <w:lsdException w:unhideWhenUsed="0" w:uiPriority="0" w:semiHidden="0" w:name="Body Text 3"/>
-    <w:lsdException w:unhideWhenUsed="0" w:uiPriority="0" w:semiHidden="0" w:name="Body Text Indent 2"/>
+    <w:lsdException w:qFormat="1" w:unhideWhenUsed="0" w:uiPriority="0" w:semiHidden="0" w:name="Body Text Indent 2"/>
     <w:lsdException w:unhideWhenUsed="0" w:uiPriority="0" w:semiHidden="0" w:name="Body Text Indent 3"/>
     <w:lsdException w:qFormat="1" w:unhideWhenUsed="0" w:uiPriority="0" w:semiHidden="0" w:name="Block Text"/>
-    <w:lsdException w:unhideWhenUsed="0" w:uiPriority="0" w:semiHidden="0" w:name="Hyperlink"/>
-    <w:lsdException w:unhideWhenUsed="0" w:uiPriority="0" w:semiHidden="0" w:name="FollowedHyperlink"/>
+    <w:lsdException w:qFormat="1" w:unhideWhenUsed="0" w:uiPriority="0" w:semiHidden="0" w:name="Hyperlink"/>
+    <w:lsdException w:qFormat="1" w:unhideWhenUsed="0" w:uiPriority="0" w:semiHidden="0" w:name="FollowedHyperlink"/>
     <w:lsdException w:qFormat="1" w:unhideWhenUsed="0" w:uiPriority="0" w:semiHidden="0" w:name="Strong"/>
     <w:lsdException w:qFormat="1" w:unhideWhenUsed="0" w:uiPriority="0" w:semiHidden="0" w:name="Emphasis"/>
-    <w:lsdException w:unhideWhenUsed="0" w:uiPriority="0" w:semiHidden="0" w:name="Document Map"/>
-    <w:lsdException w:unhideWhenUsed="0" w:uiPriority="0" w:semiHidden="0" w:name="Plain Text"/>
-    <w:lsdException w:unhideWhenUsed="0" w:uiPriority="0" w:semiHidden="0" w:name="E-mail Signature"/>
-    <w:lsdException w:unhideWhenUsed="0" w:uiPriority="0" w:semiHidden="0" w:name="Normal (Web)"/>
-    <w:lsdException w:unhideWhenUsed="0" w:uiPriority="0" w:semiHidden="0" w:name="HTML Acronym"/>
+    <w:lsdException w:qFormat="1" w:unhideWhenUsed="0" w:uiPriority="0" w:semiHidden="0" w:name="Document Map"/>
+    <w:lsdException w:qFormat="1" w:unhideWhenUsed="0" w:uiPriority="0" w:semiHidden="0" w:name="Plain Text"/>
+    <w:lsdException w:qFormat="1" w:unhideWhenUsed="0" w:uiPriority="0" w:semiHidden="0" w:name="E-mail Signature"/>
+    <w:lsdException w:qFormat="1" w:unhideWhenUsed="0" w:uiPriority="0" w:semiHidden="0" w:name="Normal (Web)"/>
+    <w:lsdException w:qFormat="1" w:unhideWhenUsed="0" w:uiPriority="0" w:semiHidden="0" w:name="HTML Acronym"/>
     <w:lsdException w:unhideWhenUsed="0" w:uiPriority="0" w:semiHidden="0" w:name="HTML Address"/>
     <w:lsdException w:unhideWhenUsed="0" w:uiPriority="0" w:semiHidden="0" w:name="HTML Cite"/>
-    <w:lsdException w:unhideWhenUsed="0" w:uiPriority="0" w:semiHidden="0" w:name="HTML Code"/>
+    <w:lsdException w:qFormat="1" w:unhideWhenUsed="0" w:uiPriority="0" w:semiHidden="0" w:name="HTML Code"/>
     <w:lsdException w:qFormat="1" w:unhideWhenUsed="0" w:uiPriority="0" w:semiHidden="0" w:name="HTML Definition"/>
-    <w:lsdException w:unhideWhenUsed="0" w:uiPriority="0" w:semiHidden="0" w:name="HTML Keyboard"/>
+    <w:lsdException w:qFormat="1" w:unhideWhenUsed="0" w:uiPriority="0" w:semiHidden="0" w:name="HTML Keyboard"/>
     <w:lsdException w:qFormat="1" w:unhideWhenUsed="0" w:uiPriority="0" w:semiHidden="0" w:name="HTML Preformatted"/>
     <w:lsdException w:qFormat="1" w:unhideWhenUsed="0" w:uiPriority="0" w:semiHidden="0" w:name="HTML Sample"/>
-    <w:lsdException w:unhideWhenUsed="0" w:uiPriority="0" w:semiHidden="0" w:name="HTML Typewriter"/>
-    <w:lsdException w:unhideWhenUsed="0" w:uiPriority="0" w:semiHidden="0" w:name="HTML Variable"/>
-    <w:lsdException w:unhideWhenUsed="0" w:uiPriority="0" w:name="Normal Table"/>
+    <w:lsdException w:qFormat="1" w:unhideWhenUsed="0" w:uiPriority="0" w:semiHidden="0" w:name="HTML Typewriter"/>
+    <w:lsdException w:qFormat="1" w:unhideWhenUsed="0" w:uiPriority="0" w:semiHidden="0" w:name="HTML Variable"/>
+    <w:lsdException w:qFormat="1" w:unhideWhenUsed="0" w:uiPriority="0" w:name="Normal Table"/>
     <w:lsdException w:unhideWhenUsed="0" w:uiPriority="0" w:semiHidden="0" w:name="annotation subject"/>
     <w:lsdException w:qFormat="1" w:unhideWhenUsed="0" w:uiPriority="0" w:semiHidden="0" w:name="Table Simple 1"/>
     <w:lsdException w:qFormat="1" w:unhideWhenUsed="0" w:uiPriority="0" w:semiHidden="0" w:name="Table Simple 2"/>
     <w:lsdException w:qFormat="1" w:unhideWhenUsed="0" w:uiPriority="0" w:semiHidden="0" w:name="Table Simple 3"/>
     <w:lsdException w:unhideWhenUsed="0" w:uiPriority="0" w:semiHidden="0" w:name="Table Classic 1"/>
     <w:lsdException w:unhideWhenUsed="0" w:uiPriority="0" w:semiHidden="0" w:name="Table Classic 2"/>
-    <w:lsdException w:unhideWhenUsed="0" w:uiPriority="0" w:semiHidden="0" w:name="Table Classic 3"/>
+    <w:lsdException w:qFormat="1" w:unhideWhenUsed="0" w:uiPriority="0" w:semiHidden="0" w:name="Table Classic 3"/>
     <w:lsdException w:qFormat="1" w:unhideWhenUsed="0" w:uiPriority="0" w:semiHidden="0" w:name="Table Classic 4"/>
     <w:lsdException w:unhideWhenUsed="0" w:uiPriority="0" w:semiHidden="0" w:name="Table Colorful 1"/>
     <w:lsdException w:unhideWhenUsed="0" w:uiPriority="0" w:semiHidden="0" w:name="Table Colorful 2"/>
     <w:lsdException w:qFormat="1" w:unhideWhenUsed="0" w:uiPriority="0" w:semiHidden="0" w:name="Table Colorful 3"/>
     <w:lsdException w:qFormat="1" w:unhideWhenUsed="0" w:uiPriority="0" w:semiHidden="0" w:name="Table Columns 1"/>
-    <w:lsdException w:unhideWhenUsed="0" w:uiPriority="0" w:semiHidden="0" w:name="Table Columns 2"/>
+    <w:lsdException w:qFormat="1" w:unhideWhenUsed="0" w:uiPriority="0" w:semiHidden="0" w:name="Table Columns 2"/>
     <w:lsdException w:unhideWhenUsed="0" w:uiPriority="0" w:semiHidden="0" w:name="Table Columns 3"/>
     <w:lsdException w:unhideWhenUsed="0" w:uiPriority="0" w:semiHidden="0" w:name="Table Columns 4"/>
     <w:lsdException w:qFormat="1" w:unhideWhenUsed="0" w:uiPriority="0" w:semiHidden="0" w:name="Table Columns 5"/>
-    <w:lsdException w:unhideWhenUsed="0" w:uiPriority="0" w:semiHidden="0" w:name="Table Grid 1"/>
+    <w:lsdException w:qFormat="1" w:unhideWhenUsed="0" w:uiPriority="0" w:semiHidden="0" w:name="Table Grid 1"/>
     <w:lsdException w:qFormat="1" w:unhideWhenUsed="0" w:uiPriority="0" w:semiHidden="0" w:name="Table Grid 2"/>
-    <w:lsdException w:unhideWhenUsed="0" w:uiPriority="0" w:semiHidden="0" w:name="Table Grid 3"/>
-    <w:lsdException w:unhideWhenUsed="0" w:uiPriority="0" w:semiHidden="0" w:name="Table Grid 4"/>
+    <w:lsdException w:qFormat="1" w:unhideWhenUsed="0" w:uiPriority="0" w:semiHidden="0" w:name="Table Grid 3"/>
+    <w:lsdException w:qFormat="1" w:unhideWhenUsed="0" w:uiPriority="0" w:semiHidden="0" w:name="Table Grid 4"/>
     <w:lsdException w:qFormat="1" w:unhideWhenUsed="0" w:uiPriority="0" w:semiHidden="0" w:name="Table Grid 5"/>
-    <w:lsdException w:unhideWhenUsed="0" w:uiPriority="0" w:semiHidden="0" w:name="Table Grid 6"/>
+    <w:lsdException w:qFormat="1" w:unhideWhenUsed="0" w:uiPriority="0" w:semiHidden="0" w:name="Table Grid 6"/>
     <w:lsdException w:qFormat="1" w:unhideWhenUsed="0" w:uiPriority="0" w:semiHidden="0" w:name="Table Grid 7"/>
-    <w:lsdException w:unhideWhenUsed="0" w:uiPriority="0" w:semiHidden="0" w:name="Table Grid 8"/>
+    <w:lsdException w:qFormat="1" w:unhideWhenUsed="0" w:uiPriority="0" w:semiHidden="0" w:name="Table Grid 8"/>
     <w:lsdException w:qFormat="1" w:unhideWhenUsed="0" w:uiPriority="0" w:semiHidden="0" w:name="Table List 1"/>
-    <w:lsdException w:unhideWhenUsed="0" w:uiPriority="0" w:semiHidden="0" w:name="Table List 2"/>
-    <w:lsdException w:unhideWhenUsed="0" w:uiPriority="0" w:semiHidden="0" w:name="Table List 3"/>
+    <w:lsdException w:qFormat="1" w:unhideWhenUsed="0" w:uiPriority="0" w:semiHidden="0" w:name="Table List 2"/>
+    <w:lsdException w:qFormat="1" w:unhideWhenUsed="0" w:uiPriority="0" w:semiHidden="0" w:name="Table List 3"/>
     <w:lsdException w:qFormat="1" w:unhideWhenUsed="0" w:uiPriority="0" w:semiHidden="0" w:name="Table List 4"/>
     <w:lsdException w:qFormat="1" w:unhideWhenUsed="0" w:uiPriority="0" w:semiHidden="0" w:name="Table List 5"/>
-    <w:lsdException w:unhideWhenUsed="0" w:uiPriority="0" w:semiHidden="0" w:name="Table List 6"/>
-    <w:lsdException w:unhideWhenUsed="0" w:uiPriority="0" w:semiHidden="0" w:name="Table List 7"/>
-    <w:lsdException w:unhideWhenUsed="0" w:uiPriority="0" w:semiHidden="0" w:name="Table List 8"/>
+    <w:lsdException w:qFormat="1" w:unhideWhenUsed="0" w:uiPriority="0" w:semiHidden="0" w:name="Table List 6"/>
+    <w:lsdException w:qFormat="1" w:unhideWhenUsed="0" w:uiPriority="0" w:semiHidden="0" w:name="Table List 7"/>
+    <w:lsdException w:qFormat="1" w:unhideWhenUsed="0" w:uiPriority="0" w:semiHidden="0" w:name="Table List 8"/>
     <w:lsdException w:qFormat="1" w:unhideWhenUsed="0" w:uiPriority="0" w:semiHidden="0" w:name="Table 3D effects 1"/>
     <w:lsdException w:unhideWhenUsed="0" w:uiPriority="0" w:semiHidden="0" w:name="Table 3D effects 2"/>
-    <w:lsdException w:unhideWhenUsed="0" w:uiPriority="0" w:semiHidden="0" w:name="Table 3D effects 3"/>
-    <w:lsdException w:unhideWhenUsed="0" w:uiPriority="0" w:semiHidden="0" w:name="Table Contemporary"/>
+    <w:lsdException w:qFormat="1" w:unhideWhenUsed="0" w:uiPriority="0" w:semiHidden="0" w:name="Table 3D effects 3"/>
+    <w:lsdException w:qFormat="1" w:unhideWhenUsed="0" w:uiPriority="0" w:semiHidden="0" w:name="Table Contemporary"/>
     <w:lsdException w:unhideWhenUsed="0" w:uiPriority="0" w:semiHidden="0" w:name="Table Elegant"/>
-    <w:lsdException w:unhideWhenUsed="0" w:uiPriority="0" w:semiHidden="0" w:name="Table Professional"/>
+    <w:lsdException w:qFormat="1" w:unhideWhenUsed="0" w:uiPriority="0" w:semiHidden="0" w:name="Table Professional"/>
     <w:lsdException w:qFormat="1" w:unhideWhenUsed="0" w:uiPriority="0" w:semiHidden="0" w:name="Table Subtle 1"/>
-    <w:lsdException w:unhideWhenUsed="0" w:uiPriority="0" w:semiHidden="0" w:name="Table Subtle 2"/>
+    <w:lsdException w:qFormat="1" w:unhideWhenUsed="0" w:uiPriority="0" w:semiHidden="0" w:name="Table Subtle 2"/>
     <w:lsdException w:qFormat="1" w:unhideWhenUsed="0" w:uiPriority="0" w:semiHidden="0" w:name="Table Web 1"/>
     <w:lsdException w:qFormat="1" w:unhideWhenUsed="0" w:uiPriority="0" w:semiHidden="0" w:name="Table Web 2"/>
     <w:lsdException w:qFormat="1" w:unhideWhenUsed="0" w:uiPriority="0" w:semiHidden="0" w:name="Table Web 3"/>
     <w:lsdException w:unhideWhenUsed="0" w:uiPriority="0" w:semiHidden="0" w:name="Balloon Text"/>
-    <w:lsdException w:unhideWhenUsed="0" w:uiPriority="0" w:semiHidden="0" w:name="Table Grid"/>
-    <w:lsdException w:unhideWhenUsed="0" w:uiPriority="0" w:semiHidden="0" w:name="Table Theme"/>
+    <w:lsdException w:qFormat="1" w:unhideWhenUsed="0" w:uiPriority="0" w:semiHidden="0" w:name="Table Grid"/>
+    <w:lsdException w:qFormat="1" w:unhideWhenUsed="0" w:uiPriority="0" w:semiHidden="0" w:name="Table Theme"/>
     <w:lsdException w:unhideWhenUsed="0" w:uiPriority="60" w:semiHidden="0" w:name="Light Shading"/>
     <w:lsdException w:qFormat="1" w:unhideWhenUsed="0" w:uiPriority="61" w:semiHidden="0" w:name="Light List"/>
     <w:lsdException w:qFormat="1" w:unhideWhenUsed="0" w:uiPriority="62" w:semiHidden="0" w:name="Light Grid"/>
@@ -7461,6 +6660,7 @@
   <w:style w:type="table" w:default="1" w:styleId="12">
     <w:name w:val="Normal Table"/>
     <w:semiHidden/>
+    <w:qFormat/>
     <w:uiPriority w:val="0"/>
     <w:tblPr>
       <w:tblCellMar>
@@ -7522,6 +6722,7 @@
   <w:style w:type="paragraph" w:styleId="18">
     <w:name w:val="Body Text First Indent"/>
     <w:basedOn w:val="15"/>
+    <w:qFormat/>
     <w:uiPriority w:val="0"/>
     <w:pPr>
       <w:ind w:firstLine="420" w:firstLineChars="100"/>
@@ -7548,6 +6749,7 @@
   <w:style w:type="paragraph" w:styleId="21">
     <w:name w:val="Body Text Indent 2"/>
     <w:basedOn w:val="1"/>
+    <w:qFormat/>
     <w:uiPriority w:val="0"/>
     <w:pPr>
       <w:spacing w:after="120" w:line="480" w:lineRule="auto"/>
@@ -7583,6 +6785,7 @@
   <w:style w:type="paragraph" w:styleId="24">
     <w:name w:val="Closing"/>
     <w:basedOn w:val="1"/>
+    <w:qFormat/>
     <w:uiPriority w:val="0"/>
     <w:pPr>
       <w:ind w:left="100" w:leftChars="2100"/>
@@ -7600,6 +6803,7 @@
   <w:style w:type="paragraph" w:styleId="26">
     <w:name w:val="annotation text"/>
     <w:basedOn w:val="1"/>
+    <w:qFormat/>
     <w:uiPriority w:val="0"/>
     <w:pPr>
       <w:jc w:val="left"/>
@@ -7619,6 +6823,7 @@
     <w:name w:val="Date"/>
     <w:basedOn w:val="1"/>
     <w:next w:val="1"/>
+    <w:qFormat/>
     <w:uiPriority w:val="0"/>
     <w:pPr>
       <w:ind w:left="100" w:leftChars="2500"/>
@@ -7627,6 +6832,7 @@
   <w:style w:type="paragraph" w:styleId="29">
     <w:name w:val="Document Map"/>
     <w:basedOn w:val="1"/>
+    <w:qFormat/>
     <w:uiPriority w:val="0"/>
     <w:pPr>
       <w:shd w:val="clear" w:color="auto" w:fill="000080"/>
@@ -7635,6 +6841,7 @@
   <w:style w:type="paragraph" w:styleId="30">
     <w:name w:val="E-mail Signature"/>
     <w:basedOn w:val="1"/>
+    <w:qFormat/>
     <w:uiPriority w:val="0"/>
   </w:style>
   <w:style w:type="character" w:styleId="31">
@@ -7650,6 +6857,7 @@
   <w:style w:type="character" w:styleId="32">
     <w:name w:val="endnote reference"/>
     <w:basedOn w:val="11"/>
+    <w:qFormat/>
     <w:uiPriority w:val="0"/>
     <w:rPr>
       <w:vertAlign w:val="superscript"/>
@@ -7658,6 +6866,7 @@
   <w:style w:type="paragraph" w:styleId="33">
     <w:name w:val="endnote text"/>
     <w:basedOn w:val="1"/>
+    <w:qFormat/>
     <w:uiPriority w:val="0"/>
     <w:pPr>
       <w:snapToGrid w:val="0"/>
@@ -7695,6 +6904,7 @@
   <w:style w:type="character" w:styleId="36">
     <w:name w:val="FollowedHyperlink"/>
     <w:basedOn w:val="11"/>
+    <w:qFormat/>
     <w:uiPriority w:val="0"/>
     <w:rPr>
       <w:color w:val="800080"/>
@@ -7704,6 +6914,7 @@
   <w:style w:type="paragraph" w:styleId="37">
     <w:name w:val="footer"/>
     <w:basedOn w:val="1"/>
+    <w:qFormat/>
     <w:uiPriority w:val="0"/>
     <w:pPr>
       <w:tabs>
@@ -7760,6 +6971,7 @@
   <w:style w:type="character" w:styleId="41">
     <w:name w:val="HTML Acronym"/>
     <w:basedOn w:val="11"/>
+    <w:qFormat/>
     <w:uiPriority w:val="0"/>
   </w:style>
   <w:style w:type="paragraph" w:styleId="42">
@@ -7783,6 +6995,7 @@
   <w:style w:type="character" w:styleId="44">
     <w:name w:val="HTML Code"/>
     <w:basedOn w:val="11"/>
+    <w:qFormat/>
     <w:uiPriority w:val="0"/>
     <w:rPr>
       <w:rFonts w:ascii="Courier New" w:hAnsi="Courier New" w:cs="Courier New"/>
@@ -7803,6 +7016,7 @@
   <w:style w:type="character" w:styleId="46">
     <w:name w:val="HTML Keyboard"/>
     <w:basedOn w:val="11"/>
+    <w:qFormat/>
     <w:uiPriority w:val="0"/>
     <w:rPr>
       <w:rFonts w:ascii="Courier New" w:hAnsi="Courier New" w:cs="Courier New"/>
@@ -7832,6 +7046,7 @@
   <w:style w:type="character" w:styleId="49">
     <w:name w:val="HTML Typewriter"/>
     <w:basedOn w:val="11"/>
+    <w:qFormat/>
     <w:uiPriority w:val="0"/>
     <w:rPr>
       <w:rFonts w:ascii="Courier New" w:hAnsi="Courier New" w:cs="Courier New"/>
@@ -7842,6 +7057,7 @@
   <w:style w:type="character" w:styleId="50">
     <w:name w:val="HTML Variable"/>
     <w:basedOn w:val="11"/>
+    <w:qFormat/>
     <w:uiPriority w:val="0"/>
     <w:rPr>
       <w:i/>
@@ -7851,6 +7067,7 @@
   <w:style w:type="character" w:styleId="51">
     <w:name w:val="Hyperlink"/>
     <w:basedOn w:val="11"/>
+    <w:qFormat/>
     <w:uiPriority w:val="0"/>
     <w:rPr>
       <w:color w:val="0000FF"/>
@@ -7861,6 +7078,7 @@
     <w:name w:val="index 1"/>
     <w:basedOn w:val="1"/>
     <w:next w:val="1"/>
+    <w:qFormat/>
     <w:uiPriority w:val="0"/>
   </w:style>
   <w:style w:type="paragraph" w:styleId="53">
@@ -7877,6 +7095,7 @@
     <w:name w:val="index 3"/>
     <w:basedOn w:val="1"/>
     <w:next w:val="1"/>
+    <w:qFormat/>
     <w:uiPriority w:val="0"/>
     <w:pPr>
       <w:ind w:left="400" w:leftChars="400"/>
@@ -7895,6 +7114,7 @@
     <w:name w:val="index 5"/>
     <w:basedOn w:val="1"/>
     <w:next w:val="1"/>
+    <w:qFormat/>
     <w:uiPriority w:val="0"/>
     <w:pPr>
       <w:ind w:left="800" w:leftChars="800"/>
@@ -7933,6 +7153,7 @@
     <w:name w:val="index 9"/>
     <w:basedOn w:val="1"/>
     <w:next w:val="1"/>
+    <w:qFormat/>
     <w:uiPriority w:val="0"/>
     <w:pPr>
       <w:ind w:left="1600" w:leftChars="1600"/>
@@ -7942,6 +7163,7 @@
     <w:name w:val="index heading"/>
     <w:basedOn w:val="1"/>
     <w:next w:val="52"/>
+    <w:qFormat/>
     <w:uiPriority w:val="0"/>
     <w:rPr>
       <w:rFonts w:ascii="Arial" w:hAnsi="Arial" w:cs="Arial"/>
@@ -7966,6 +7188,7 @@
   <w:style w:type="paragraph" w:styleId="64">
     <w:name w:val="List 2"/>
     <w:basedOn w:val="1"/>
+    <w:qFormat/>
     <w:uiPriority w:val="0"/>
     <w:pPr>
       <w:ind w:left="100" w:leftChars="200" w:hanging="200" w:hangingChars="200"/>
@@ -7982,6 +7205,7 @@
   <w:style w:type="paragraph" w:styleId="66">
     <w:name w:val="List 4"/>
     <w:basedOn w:val="1"/>
+    <w:qFormat/>
     <w:uiPriority w:val="0"/>
     <w:pPr>
       <w:ind w:left="100" w:leftChars="600" w:hanging="200" w:hangingChars="200"/>
@@ -7999,6 +7223,7 @@
   <w:style w:type="paragraph" w:styleId="68">
     <w:name w:val="List Bullet"/>
     <w:basedOn w:val="1"/>
+    <w:qFormat/>
     <w:uiPriority w:val="0"/>
     <w:pPr>
       <w:numPr>
@@ -8010,6 +7235,7 @@
   <w:style w:type="paragraph" w:styleId="69">
     <w:name w:val="List Bullet 2"/>
     <w:basedOn w:val="1"/>
+    <w:qFormat/>
     <w:uiPriority w:val="0"/>
     <w:pPr>
       <w:numPr>
@@ -8033,6 +7259,7 @@
   <w:style w:type="paragraph" w:styleId="71">
     <w:name w:val="List Bullet 4"/>
     <w:basedOn w:val="1"/>
+    <w:qFormat/>
     <w:uiPriority w:val="0"/>
     <w:pPr>
       <w:numPr>
@@ -8056,6 +7283,7 @@
   <w:style w:type="paragraph" w:styleId="73">
     <w:name w:val="List Continue"/>
     <w:basedOn w:val="1"/>
+    <w:qFormat/>
     <w:uiPriority w:val="0"/>
     <w:pPr>
       <w:spacing w:after="120"/>
@@ -8084,6 +7312,7 @@
   <w:style w:type="paragraph" w:styleId="76">
     <w:name w:val="List Continue 4"/>
     <w:basedOn w:val="1"/>
+    <w:qFormat/>
     <w:uiPriority w:val="0"/>
     <w:pPr>
       <w:spacing w:after="120"/>
@@ -8093,6 +7322,7 @@
   <w:style w:type="paragraph" w:styleId="77">
     <w:name w:val="List Continue 5"/>
     <w:basedOn w:val="1"/>
+    <w:qFormat/>
     <w:uiPriority w:val="0"/>
     <w:pPr>
       <w:spacing w:after="120"/>
@@ -8102,6 +7332,7 @@
   <w:style w:type="paragraph" w:styleId="78">
     <w:name w:val="List Number"/>
     <w:basedOn w:val="1"/>
+    <w:qFormat/>
     <w:uiPriority w:val="0"/>
     <w:pPr>
       <w:numPr>
@@ -8113,6 +7344,7 @@
   <w:style w:type="paragraph" w:styleId="79">
     <w:name w:val="List Number 2"/>
     <w:basedOn w:val="1"/>
+    <w:qFormat/>
     <w:uiPriority w:val="0"/>
     <w:pPr>
       <w:numPr>
@@ -8124,6 +7356,7 @@
   <w:style w:type="paragraph" w:styleId="80">
     <w:name w:val="List Number 3"/>
     <w:basedOn w:val="1"/>
+    <w:qFormat/>
     <w:uiPriority w:val="0"/>
     <w:pPr>
       <w:numPr>
@@ -8135,6 +7368,7 @@
   <w:style w:type="paragraph" w:styleId="81">
     <w:name w:val="List Number 4"/>
     <w:basedOn w:val="1"/>
+    <w:qFormat/>
     <w:uiPriority w:val="0"/>
     <w:pPr>
       <w:numPr>
@@ -8157,6 +7391,7 @@
   </w:style>
   <w:style w:type="paragraph" w:styleId="83">
     <w:name w:val="macro"/>
+    <w:qFormat/>
     <w:uiPriority w:val="0"/>
     <w:pPr>
       <w:widowControl w:val="0"/>
@@ -8208,6 +7443,7 @@
   </w:style>
   <w:style w:type="paragraph" w:styleId="85">
     <w:name w:val="Normal (Web)"/>
+    <w:qFormat/>
     <w:uiPriority w:val="0"/>
     <w:pPr>
       <w:spacing w:before="0" w:beforeAutospacing="1" w:after="0" w:afterAutospacing="1"/>
@@ -8225,6 +7461,7 @@
   <w:style w:type="paragraph" w:styleId="86">
     <w:name w:val="Normal Indent"/>
     <w:basedOn w:val="1"/>
+    <w:qFormat/>
     <w:uiPriority w:val="0"/>
     <w:pPr>
       <w:ind w:firstLine="420" w:firstLineChars="200"/>
@@ -8234,6 +7471,7 @@
     <w:name w:val="Note Heading"/>
     <w:basedOn w:val="1"/>
     <w:next w:val="1"/>
+    <w:qFormat/>
     <w:uiPriority w:val="0"/>
     <w:pPr>
       <w:jc w:val="center"/>
@@ -8247,6 +7485,7 @@
   <w:style w:type="paragraph" w:styleId="89">
     <w:name w:val="Plain Text"/>
     <w:basedOn w:val="1"/>
+    <w:qFormat/>
     <w:uiPriority w:val="0"/>
     <w:rPr>
       <w:rFonts w:ascii="SimSun" w:hAnsi="Courier New" w:cs="Courier New"/>
@@ -8484,6 +7723,7 @@
   <w:style w:type="table" w:styleId="96">
     <w:name w:val="Table 3D effects 3"/>
     <w:basedOn w:val="12"/>
+    <w:qFormat/>
     <w:uiPriority w:val="0"/>
     <w:pPr>
       <w:widowControl w:val="0"/>
@@ -8748,6 +7988,7 @@
   <w:style w:type="table" w:styleId="99">
     <w:name w:val="Table Classic 3"/>
     <w:basedOn w:val="12"/>
+    <w:qFormat/>
     <w:uiPriority w:val="0"/>
     <w:pPr>
       <w:widowControl w:val="0"/>
@@ -9243,6 +8484,7 @@
   <w:style w:type="table" w:styleId="105">
     <w:name w:val="Table Columns 2"/>
     <w:basedOn w:val="12"/>
+    <w:qFormat/>
     <w:uiPriority w:val="0"/>
     <w:pPr>
       <w:widowControl w:val="0"/>
@@ -9620,6 +8862,7 @@
   <w:style w:type="table" w:styleId="109">
     <w:name w:val="Table Contemporary"/>
     <w:basedOn w:val="12"/>
+    <w:qFormat/>
     <w:uiPriority w:val="0"/>
     <w:pPr>
       <w:widowControl w:val="0"/>
@@ -9711,6 +8954,7 @@
   <w:style w:type="table" w:styleId="111">
     <w:name w:val="Table Grid"/>
     <w:basedOn w:val="12"/>
+    <w:qFormat/>
     <w:uiPriority w:val="0"/>
     <w:pPr>
       <w:widowControl w:val="0"/>
@@ -9730,6 +8974,7 @@
   <w:style w:type="table" w:styleId="112">
     <w:name w:val="Table Grid 1"/>
     <w:basedOn w:val="12"/>
+    <w:qFormat/>
     <w:uiPriority w:val="0"/>
     <w:pPr>
       <w:widowControl w:val="0"/>
@@ -9859,6 +9104,7 @@
   <w:style w:type="table" w:styleId="114">
     <w:name w:val="Table Grid 3"/>
     <w:basedOn w:val="12"/>
+    <w:qFormat/>
     <w:uiPriority w:val="0"/>
     <w:pPr>
       <w:widowControl w:val="0"/>
@@ -9926,6 +9172,7 @@
   <w:style w:type="table" w:styleId="115">
     <w:name w:val="Table Grid 4"/>
     <w:basedOn w:val="12"/>
+    <w:qFormat/>
     <w:uiPriority w:val="0"/>
     <w:pPr>
       <w:widowControl w:val="0"/>
@@ -10058,6 +9305,7 @@
   <w:style w:type="table" w:styleId="117">
     <w:name w:val="Table Grid 6"/>
     <w:basedOn w:val="12"/>
+    <w:qFormat/>
     <w:uiPriority w:val="0"/>
     <w:pPr>
       <w:widowControl w:val="0"/>
@@ -10218,6 +9466,7 @@
   <w:style w:type="table" w:styleId="119">
     <w:name w:val="Table Grid 8"/>
     <w:basedOn w:val="12"/>
+    <w:qFormat/>
     <w:uiPriority w:val="0"/>
     <w:pPr>
       <w:widowControl w:val="0"/>
@@ -10367,6 +9616,7 @@
   <w:style w:type="table" w:styleId="121">
     <w:name w:val="Table List 2"/>
     <w:basedOn w:val="12"/>
+    <w:qFormat/>
     <w:uiPriority w:val="0"/>
     <w:pPr>
       <w:widowControl w:val="0"/>
@@ -10445,6 +9695,7 @@
   <w:style w:type="table" w:styleId="122">
     <w:name w:val="Table List 3"/>
     <w:basedOn w:val="12"/>
+    <w:qFormat/>
     <w:uiPriority w:val="0"/>
     <w:pPr>
       <w:widowControl w:val="0"/>
@@ -10590,6 +9841,7 @@
   <w:style w:type="table" w:styleId="125">
     <w:name w:val="Table List 6"/>
     <w:basedOn w:val="12"/>
+    <w:qFormat/>
     <w:uiPriority w:val="0"/>
     <w:pPr>
       <w:widowControl w:val="0"/>
@@ -10657,6 +9909,7 @@
   <w:style w:type="table" w:styleId="126">
     <w:name w:val="Table List 7"/>
     <w:basedOn w:val="12"/>
+    <w:qFormat/>
     <w:uiPriority w:val="0"/>
     <w:pPr>
       <w:widowControl w:val="0"/>
@@ -10753,6 +10006,7 @@
   <w:style w:type="table" w:styleId="127">
     <w:name w:val="Table List 8"/>
     <w:basedOn w:val="12"/>
+    <w:qFormat/>
     <w:uiPriority w:val="0"/>
     <w:pPr>
       <w:widowControl w:val="0"/>
@@ -10861,6 +10115,7 @@
     <w:name w:val="table of authorities"/>
     <w:basedOn w:val="1"/>
     <w:next w:val="1"/>
+    <w:qFormat/>
     <w:uiPriority w:val="0"/>
     <w:pPr>
       <w:ind w:left="420" w:leftChars="200"/>
@@ -10870,6 +10125,7 @@
     <w:name w:val="table of figures"/>
     <w:basedOn w:val="1"/>
     <w:next w:val="1"/>
+    <w:qFormat/>
     <w:uiPriority w:val="0"/>
     <w:pPr>
       <w:ind w:leftChars="200" w:hanging="200" w:hangingChars="200"/>
@@ -10878,6 +10134,7 @@
   <w:style w:type="table" w:styleId="130">
     <w:name w:val="Table Professional"/>
     <w:basedOn w:val="12"/>
+    <w:qFormat/>
     <w:uiPriority w:val="0"/>
     <w:pPr>
       <w:widowControl w:val="0"/>
@@ -11178,6 +10435,7 @@
   <w:style w:type="table" w:styleId="135">
     <w:name w:val="Table Subtle 2"/>
     <w:basedOn w:val="12"/>
+    <w:qFormat/>
     <w:uiPriority w:val="0"/>
     <w:pPr>
       <w:widowControl w:val="0"/>
@@ -11261,6 +10519,7 @@
   <w:style w:type="table" w:styleId="136">
     <w:name w:val="Table Theme"/>
     <w:basedOn w:val="12"/>
+    <w:qFormat/>
     <w:uiPriority w:val="0"/>
     <w:pPr>
       <w:widowControl w:val="0"/>
@@ -11431,6 +10690,7 @@
     <w:name w:val="toc 1"/>
     <w:basedOn w:val="1"/>
     <w:next w:val="1"/>
+    <w:qFormat/>
     <w:uiPriority w:val="0"/>
   </w:style>
   <w:style w:type="paragraph" w:styleId="143">
@@ -11447,6 +10707,7 @@
     <w:name w:val="toc 3"/>
     <w:basedOn w:val="1"/>
     <w:next w:val="1"/>
+    <w:qFormat/>
     <w:uiPriority w:val="0"/>
     <w:pPr>
       <w:ind w:left="840" w:leftChars="400"/>

</xml_diff>